<commit_message>
feat: customize AI training and practice assets for MiraeN
</commit_message>
<xml_diff>
--- a/업무자동화_자료/실습5_만족도_분석요약.docx
+++ b/업무자동화_자료/실습5_만족도_분석요약.docx
@@ -3,291 +3,813 @@
 <w:document xmlns:wpc="http://schemas.microsoft.com/office/word/2010/wordprocessingCanvas" xmlns:mo="http://schemas.microsoft.com/office/mac/office/2008/main" xmlns:mc="http://schemas.openxmlformats.org/markup-compatibility/2006" xmlns:mv="urn:schemas-microsoft-com:mac:vml" xmlns:o="urn:schemas-microsoft-com:office:office" xmlns:r="http://schemas.openxmlformats.org/officeDocument/2006/relationships" xmlns:m="http://schemas.openxmlformats.org/officeDocument/2006/math" xmlns:v="urn:schemas-microsoft-com:vml" xmlns:wp14="http://schemas.microsoft.com/office/word/2010/wordprocessingDrawing" xmlns:wp="http://schemas.openxmlformats.org/drawingml/2006/wordprocessingDrawing" xmlns:w10="urn:schemas-microsoft-com:office:word" xmlns:w="http://schemas.openxmlformats.org/wordprocessingml/2006/main" xmlns:w14="http://schemas.microsoft.com/office/word/2010/wordml" xmlns:wpg="http://schemas.microsoft.com/office/word/2010/wordprocessingGroup" xmlns:wpi="http://schemas.microsoft.com/office/word/2010/wordprocessingInk" xmlns:wne="http://schemas.microsoft.com/office/word/2006/wordml" xmlns:wps="http://schemas.microsoft.com/office/word/2010/wordprocessingShape" mc:Ignorable="w14 wp14">
   <w:body>
     <w:p>
+      <w:pPr>
+        <w:pStyle w:val="Title"/>
+      </w:pPr>
       <w:r>
-        <w:rPr>
-          <w:rFonts w:ascii="맑은 고딕" w:hAnsi="맑은 고딕" w:eastAsia="맑은 고딕"/>
-          <w:b/>
-          <w:color w:val="153C78"/>
-          <w:sz w:val="30"/>
-        </w:rPr>
-        <w:t>2026 하반기 직원 역량개발 연수 — 만족도 조사 분석 요약</w:t>
+        <w:t>미래엔 전사 AI 업무역량 교육</w:t>
       </w:r>
     </w:p>
     <w:p>
       <w:pPr>
-        <w:ind w:left="340"/>
+        <w:pStyle w:val="Subtitle"/>
       </w:pPr>
       <w:r>
-        <w:rPr>
-          <w:rFonts w:ascii="맑은 고딕" w:hAnsi="맑은 고딕" w:eastAsia="맑은 고딕"/>
-          <w:b/>
-          <w:color w:val="5A6675"/>
-          <w:sz w:val="19"/>
-        </w:rPr>
-        <w:t>문서 성격</w:t>
+        <w:t>만족도 조사 분석 요약</w:t>
       </w:r>
+    </w:p>
+    <w:p>
       <w:r>
-        <w:rPr>
-          <w:rFonts w:ascii="맑은 고딕" w:hAnsi="맑은 고딕" w:eastAsia="맑은 고딕"/>
-          <w:b w:val="0"/>
-          <w:color w:val="5A6675"/>
-          <w:sz w:val="19"/>
-        </w:rPr>
-        <w:t>: 만족도 설문(72명 응답) 분석 결과 요약 · 보고 장표 제작 실습용 재료</w:t>
+        <w:t>실습용 가상 자료입니다. 실제 미래엔 조직·인사정책·교육제도·성과를 나타내지 않습니다.</w:t>
+      </w:r>
+    </w:p>
+    <w:p>
+      <w:r>
+        <w:t>활용 방법: 이 요약을 Napkin·NotebookLM·Claude에 입력해 보고용 장표를 만듭니다.</w:t>
       </w:r>
     </w:p>
     <w:p>
       <w:pPr>
-        <w:ind w:left="340"/>
+        <w:pStyle w:val="Heading1"/>
       </w:pPr>
       <w:r>
-        <w:rPr>
-          <w:rFonts w:ascii="맑은 고딕" w:hAnsi="맑은 고딕" w:eastAsia="맑은 고딕"/>
-          <w:b/>
-          <w:color w:val="5A6675"/>
-          <w:sz w:val="19"/>
-        </w:rPr>
-        <w:t>활용 방법</w:t>
-      </w:r>
-      <w:r>
-        <w:rPr>
-          <w:rFonts w:ascii="맑은 고딕" w:hAnsi="맑은 고딕" w:eastAsia="맑은 고딕"/>
-          <w:b w:val="0"/>
-          <w:color w:val="5A6675"/>
-          <w:sz w:val="19"/>
-        </w:rPr>
-        <w:t>: 이 내용을 시각화 도구(Napkin·NotebookLM·Claude)에 붙여넣거나 업로드해 보고용 장표를 만듭니다.</w:t>
+        <w:t>1. 조사 개요</w:t>
       </w:r>
     </w:p>
     <w:p>
       <w:r>
-        <w:rPr>
-          <w:rFonts w:ascii="맑은 고딕" w:hAnsi="맑은 고딕" w:eastAsia="맑은 고딕"/>
-          <w:b w:val="0"/>
-          <w:color w:val="5A6675"/>
-          <w:sz w:val="16"/>
-        </w:rPr>
-        <w:t>────────────────────────────────────────</w:t>
+        <w:t>대상: AI 업무 기본·데이터 분석·사내 보고서·교육콘텐츠 검수·제작운영·고객응대 6개 과정의 가상 참여자</w:t>
+      </w:r>
+    </w:p>
+    <w:p>
+      <w:r>
+        <w:t>응답: 72명. 2026년 8월 22일 온라인 제출을 상정한 별도 만족도 표본이며, 실습 1의 신청자와 동일인을 연결하지 않습니다.</w:t>
+      </w:r>
+    </w:p>
+    <w:p>
+      <w:r>
+        <w:t>문항: 5점 척도 5문항 + 재참여 의향 + 자유 의견. 평균은 소수 둘째 자리에서 반올림합니다.</w:t>
       </w:r>
     </w:p>
     <w:p>
       <w:pPr>
-        <w:spacing w:before="200"/>
+        <w:pStyle w:val="Heading1"/>
       </w:pPr>
       <w:r>
-        <w:rPr>
-          <w:rFonts w:ascii="맑은 고딕" w:hAnsi="맑은 고딕" w:eastAsia="맑은 고딕"/>
-          <w:b/>
-          <w:color w:val="153C78"/>
-          <w:sz w:val="24"/>
-        </w:rPr>
-        <w:t>1. 조사 개요</w:t>
+        <w:t>2. 핵심 수치</w:t>
+      </w:r>
+    </w:p>
+    <w:p>
+      <w:r>
+        <w:t>문항 평균: 전반 만족도 4.0점, 내용 구성 4.0점, 실무 적용 가능성 4.3점, 교육 환경 3.1점, 추천 의향 4.0점.</w:t>
+      </w:r>
+    </w:p>
+    <w:p>
+      <w:r>
+        <w:t>실무 적용 가능성이 가장 높고 교육 환경이 가장 낮습니다. 재참여 의향은 58명(80.6%)이 “예”로 응답했습니다.</w:t>
+      </w:r>
+    </w:p>
+    <w:tbl>
+      <w:tblPr>
+        <w:tblW w:type="auto" w:w="0"/>
+        <w:tblLayout w:type="fixed"/>
+        <w:tblLook w:firstColumn="1" w:firstRow="1" w:lastColumn="0" w:lastRow="0" w:noHBand="0" w:noVBand="1" w:val="04A0"/>
+      </w:tblPr>
+      <w:tblGrid>
+        <w:gridCol w:w="3408"/>
+        <w:gridCol w:w="3408"/>
+        <w:gridCol w:w="3408"/>
+      </w:tblGrid>
+      <w:tr>
+        <w:trPr>
+          <w:tblHeader/>
+        </w:trPr>
+        <w:tc>
+          <w:tcPr>
+            <w:tcW w:type="dxa" w:w="5616"/>
+            <w:vAlign w:val="center"/>
+            <w:tcBorders>
+              <w:top w:val="single" w:sz="4" w:color="D9D9D9"/>
+              <w:left w:val="single" w:sz="4" w:color="D9D9D9"/>
+              <w:bottom w:val="single" w:sz="4" w:color="D9D9D9"/>
+              <w:right w:val="single" w:sz="4" w:color="D9D9D9"/>
+            </w:tcBorders>
+            <w:shd w:fill="DCE6F1"/>
+            <w:tcMar>
+              <w:top w:w="75" w:type="dxa"/>
+              <w:left w:w="75" w:type="dxa"/>
+              <w:bottom w:w="75" w:type="dxa"/>
+              <w:right w:w="75" w:type="dxa"/>
+            </w:tcMar>
+          </w:tcPr>
+          <w:p>
+            <w:pPr>
+              <w:spacing w:after="20" w:line="252" w:lineRule="auto"/>
+            </w:pPr>
+            <w:r>
+              <w:rPr>
+                <w:b/>
+                <w:sz w:val="18"/>
+              </w:rPr>
+              <w:t>과정</w:t>
+            </w:r>
+          </w:p>
+        </w:tc>
+        <w:tc>
+          <w:tcPr>
+            <w:tcW w:type="dxa" w:w="1872"/>
+            <w:vAlign w:val="center"/>
+            <w:tcBorders>
+              <w:top w:val="single" w:sz="4" w:color="D9D9D9"/>
+              <w:left w:val="single" w:sz="4" w:color="D9D9D9"/>
+              <w:bottom w:val="single" w:sz="4" w:color="D9D9D9"/>
+              <w:right w:val="single" w:sz="4" w:color="D9D9D9"/>
+            </w:tcBorders>
+            <w:shd w:fill="DCE6F1"/>
+            <w:tcMar>
+              <w:top w:w="75" w:type="dxa"/>
+              <w:left w:w="75" w:type="dxa"/>
+              <w:bottom w:w="75" w:type="dxa"/>
+              <w:right w:w="75" w:type="dxa"/>
+            </w:tcMar>
+          </w:tcPr>
+          <w:p>
+            <w:pPr>
+              <w:spacing w:after="20" w:line="252" w:lineRule="auto"/>
+              <w:jc w:val="center"/>
+            </w:pPr>
+            <w:r>
+              <w:rPr>
+                <w:b/>
+                <w:sz w:val="18"/>
+              </w:rPr>
+              <w:t>응답 수(명)</w:t>
+            </w:r>
+          </w:p>
+        </w:tc>
+        <w:tc>
+          <w:tcPr>
+            <w:tcW w:type="dxa" w:w="2736"/>
+            <w:vAlign w:val="center"/>
+            <w:tcBorders>
+              <w:top w:val="single" w:sz="4" w:color="D9D9D9"/>
+              <w:left w:val="single" w:sz="4" w:color="D9D9D9"/>
+              <w:bottom w:val="single" w:sz="4" w:color="D9D9D9"/>
+              <w:right w:val="single" w:sz="4" w:color="D9D9D9"/>
+            </w:tcBorders>
+            <w:shd w:fill="DCE6F1"/>
+            <w:tcMar>
+              <w:top w:w="75" w:type="dxa"/>
+              <w:left w:w="75" w:type="dxa"/>
+              <w:bottom w:w="75" w:type="dxa"/>
+              <w:right w:w="75" w:type="dxa"/>
+            </w:tcMar>
+          </w:tcPr>
+          <w:p>
+            <w:pPr>
+              <w:spacing w:after="20" w:line="252" w:lineRule="auto"/>
+            </w:pPr>
+            <w:r>
+              <w:rPr>
+                <w:b/>
+                <w:sz w:val="18"/>
+              </w:rPr>
+              <w:t>전반 만족도(5점)</w:t>
+            </w:r>
+          </w:p>
+        </w:tc>
+      </w:tr>
+      <w:tr>
+        <w:tc>
+          <w:tcPr>
+            <w:tcW w:type="dxa" w:w="5616"/>
+            <w:vAlign w:val="center"/>
+            <w:tcBorders>
+              <w:top w:val="single" w:sz="4" w:color="D9D9D9"/>
+              <w:left w:val="single" w:sz="4" w:color="D9D9D9"/>
+              <w:bottom w:val="single" w:sz="4" w:color="D9D9D9"/>
+              <w:right w:val="single" w:sz="4" w:color="D9D9D9"/>
+            </w:tcBorders>
+            <w:shd w:fill="FFFFFF"/>
+            <w:tcMar>
+              <w:top w:w="75" w:type="dxa"/>
+              <w:left w:w="75" w:type="dxa"/>
+              <w:bottom w:w="75" w:type="dxa"/>
+              <w:right w:w="75" w:type="dxa"/>
+            </w:tcMar>
+          </w:tcPr>
+          <w:p>
+            <w:pPr>
+              <w:spacing w:after="20" w:line="252" w:lineRule="auto"/>
+            </w:pPr>
+            <w:r>
+              <w:rPr>
+                <w:b w:val="0"/>
+                <w:sz w:val="18"/>
+              </w:rPr>
+              <w:t>AI 업무 기본</w:t>
+            </w:r>
+          </w:p>
+        </w:tc>
+        <w:tc>
+          <w:tcPr>
+            <w:tcW w:type="dxa" w:w="1872"/>
+            <w:vAlign w:val="center"/>
+            <w:tcBorders>
+              <w:top w:val="single" w:sz="4" w:color="D9D9D9"/>
+              <w:left w:val="single" w:sz="4" w:color="D9D9D9"/>
+              <w:bottom w:val="single" w:sz="4" w:color="D9D9D9"/>
+              <w:right w:val="single" w:sz="4" w:color="D9D9D9"/>
+            </w:tcBorders>
+            <w:shd w:fill="FFFFFF"/>
+            <w:tcMar>
+              <w:top w:w="75" w:type="dxa"/>
+              <w:left w:w="75" w:type="dxa"/>
+              <w:bottom w:w="75" w:type="dxa"/>
+              <w:right w:w="75" w:type="dxa"/>
+            </w:tcMar>
+          </w:tcPr>
+          <w:p>
+            <w:pPr>
+              <w:spacing w:after="20" w:line="252" w:lineRule="auto"/>
+              <w:jc w:val="center"/>
+            </w:pPr>
+            <w:r>
+              <w:rPr>
+                <w:b w:val="0"/>
+                <w:sz w:val="18"/>
+              </w:rPr>
+              <w:t>26</w:t>
+            </w:r>
+          </w:p>
+        </w:tc>
+        <w:tc>
+          <w:tcPr>
+            <w:tcW w:type="dxa" w:w="2736"/>
+            <w:vAlign w:val="center"/>
+            <w:tcBorders>
+              <w:top w:val="single" w:sz="4" w:color="D9D9D9"/>
+              <w:left w:val="single" w:sz="4" w:color="D9D9D9"/>
+              <w:bottom w:val="single" w:sz="4" w:color="D9D9D9"/>
+              <w:right w:val="single" w:sz="4" w:color="D9D9D9"/>
+            </w:tcBorders>
+            <w:shd w:fill="FFFFFF"/>
+            <w:tcMar>
+              <w:top w:w="75" w:type="dxa"/>
+              <w:left w:w="75" w:type="dxa"/>
+              <w:bottom w:w="75" w:type="dxa"/>
+              <w:right w:w="75" w:type="dxa"/>
+            </w:tcMar>
+          </w:tcPr>
+          <w:p>
+            <w:pPr>
+              <w:spacing w:after="20" w:line="252" w:lineRule="auto"/>
+            </w:pPr>
+            <w:r>
+              <w:rPr>
+                <w:b w:val="0"/>
+                <w:sz w:val="18"/>
+              </w:rPr>
+              <w:t>4.5</w:t>
+            </w:r>
+          </w:p>
+        </w:tc>
+      </w:tr>
+      <w:tr>
+        <w:tc>
+          <w:tcPr>
+            <w:tcW w:type="dxa" w:w="5616"/>
+            <w:vAlign w:val="center"/>
+            <w:tcBorders>
+              <w:top w:val="single" w:sz="4" w:color="D9D9D9"/>
+              <w:left w:val="single" w:sz="4" w:color="D9D9D9"/>
+              <w:bottom w:val="single" w:sz="4" w:color="D9D9D9"/>
+              <w:right w:val="single" w:sz="4" w:color="D9D9D9"/>
+            </w:tcBorders>
+            <w:shd w:fill="FFFFFF"/>
+            <w:tcMar>
+              <w:top w:w="75" w:type="dxa"/>
+              <w:left w:w="75" w:type="dxa"/>
+              <w:bottom w:w="75" w:type="dxa"/>
+              <w:right w:w="75" w:type="dxa"/>
+            </w:tcMar>
+          </w:tcPr>
+          <w:p>
+            <w:pPr>
+              <w:spacing w:after="20" w:line="252" w:lineRule="auto"/>
+            </w:pPr>
+            <w:r>
+              <w:rPr>
+                <w:b w:val="0"/>
+                <w:sz w:val="18"/>
+              </w:rPr>
+              <w:t>AI 데이터 분석 기초</w:t>
+            </w:r>
+          </w:p>
+        </w:tc>
+        <w:tc>
+          <w:tcPr>
+            <w:tcW w:type="dxa" w:w="1872"/>
+            <w:vAlign w:val="center"/>
+            <w:tcBorders>
+              <w:top w:val="single" w:sz="4" w:color="D9D9D9"/>
+              <w:left w:val="single" w:sz="4" w:color="D9D9D9"/>
+              <w:bottom w:val="single" w:sz="4" w:color="D9D9D9"/>
+              <w:right w:val="single" w:sz="4" w:color="D9D9D9"/>
+            </w:tcBorders>
+            <w:shd w:fill="FFFFFF"/>
+            <w:tcMar>
+              <w:top w:w="75" w:type="dxa"/>
+              <w:left w:w="75" w:type="dxa"/>
+              <w:bottom w:w="75" w:type="dxa"/>
+              <w:right w:w="75" w:type="dxa"/>
+            </w:tcMar>
+          </w:tcPr>
+          <w:p>
+            <w:pPr>
+              <w:spacing w:after="20" w:line="252" w:lineRule="auto"/>
+              <w:jc w:val="center"/>
+            </w:pPr>
+            <w:r>
+              <w:rPr>
+                <w:b w:val="0"/>
+                <w:sz w:val="18"/>
+              </w:rPr>
+              <w:t>14</w:t>
+            </w:r>
+          </w:p>
+        </w:tc>
+        <w:tc>
+          <w:tcPr>
+            <w:tcW w:type="dxa" w:w="2736"/>
+            <w:vAlign w:val="center"/>
+            <w:tcBorders>
+              <w:top w:val="single" w:sz="4" w:color="D9D9D9"/>
+              <w:left w:val="single" w:sz="4" w:color="D9D9D9"/>
+              <w:bottom w:val="single" w:sz="4" w:color="D9D9D9"/>
+              <w:right w:val="single" w:sz="4" w:color="D9D9D9"/>
+            </w:tcBorders>
+            <w:shd w:fill="FFFFFF"/>
+            <w:tcMar>
+              <w:top w:w="75" w:type="dxa"/>
+              <w:left w:w="75" w:type="dxa"/>
+              <w:bottom w:w="75" w:type="dxa"/>
+              <w:right w:w="75" w:type="dxa"/>
+            </w:tcMar>
+          </w:tcPr>
+          <w:p>
+            <w:pPr>
+              <w:spacing w:after="20" w:line="252" w:lineRule="auto"/>
+            </w:pPr>
+            <w:r>
+              <w:rPr>
+                <w:b w:val="0"/>
+                <w:sz w:val="18"/>
+              </w:rPr>
+              <w:t>3.9</w:t>
+            </w:r>
+          </w:p>
+        </w:tc>
+      </w:tr>
+      <w:tr>
+        <w:tc>
+          <w:tcPr>
+            <w:tcW w:type="dxa" w:w="5616"/>
+            <w:vAlign w:val="center"/>
+            <w:tcBorders>
+              <w:top w:val="single" w:sz="4" w:color="D9D9D9"/>
+              <w:left w:val="single" w:sz="4" w:color="D9D9D9"/>
+              <w:bottom w:val="single" w:sz="4" w:color="D9D9D9"/>
+              <w:right w:val="single" w:sz="4" w:color="D9D9D9"/>
+            </w:tcBorders>
+            <w:shd w:fill="FFFFFF"/>
+            <w:tcMar>
+              <w:top w:w="75" w:type="dxa"/>
+              <w:left w:w="75" w:type="dxa"/>
+              <w:bottom w:w="75" w:type="dxa"/>
+              <w:right w:w="75" w:type="dxa"/>
+            </w:tcMar>
+          </w:tcPr>
+          <w:p>
+            <w:pPr>
+              <w:spacing w:after="20" w:line="252" w:lineRule="auto"/>
+            </w:pPr>
+            <w:r>
+              <w:rPr>
+                <w:b w:val="0"/>
+                <w:sz w:val="18"/>
+              </w:rPr>
+              <w:t>AI 사내 보고서 작성</w:t>
+            </w:r>
+          </w:p>
+        </w:tc>
+        <w:tc>
+          <w:tcPr>
+            <w:tcW w:type="dxa" w:w="1872"/>
+            <w:vAlign w:val="center"/>
+            <w:tcBorders>
+              <w:top w:val="single" w:sz="4" w:color="D9D9D9"/>
+              <w:left w:val="single" w:sz="4" w:color="D9D9D9"/>
+              <w:bottom w:val="single" w:sz="4" w:color="D9D9D9"/>
+              <w:right w:val="single" w:sz="4" w:color="D9D9D9"/>
+            </w:tcBorders>
+            <w:shd w:fill="FFFFFF"/>
+            <w:tcMar>
+              <w:top w:w="75" w:type="dxa"/>
+              <w:left w:w="75" w:type="dxa"/>
+              <w:bottom w:w="75" w:type="dxa"/>
+              <w:right w:w="75" w:type="dxa"/>
+            </w:tcMar>
+          </w:tcPr>
+          <w:p>
+            <w:pPr>
+              <w:spacing w:after="20" w:line="252" w:lineRule="auto"/>
+              <w:jc w:val="center"/>
+            </w:pPr>
+            <w:r>
+              <w:rPr>
+                <w:b w:val="0"/>
+                <w:sz w:val="18"/>
+              </w:rPr>
+              <w:t>12</w:t>
+            </w:r>
+          </w:p>
+        </w:tc>
+        <w:tc>
+          <w:tcPr>
+            <w:tcW w:type="dxa" w:w="2736"/>
+            <w:vAlign w:val="center"/>
+            <w:tcBorders>
+              <w:top w:val="single" w:sz="4" w:color="D9D9D9"/>
+              <w:left w:val="single" w:sz="4" w:color="D9D9D9"/>
+              <w:bottom w:val="single" w:sz="4" w:color="D9D9D9"/>
+              <w:right w:val="single" w:sz="4" w:color="D9D9D9"/>
+            </w:tcBorders>
+            <w:shd w:fill="FFFFFF"/>
+            <w:tcMar>
+              <w:top w:w="75" w:type="dxa"/>
+              <w:left w:w="75" w:type="dxa"/>
+              <w:bottom w:w="75" w:type="dxa"/>
+              <w:right w:w="75" w:type="dxa"/>
+            </w:tcMar>
+          </w:tcPr>
+          <w:p>
+            <w:pPr>
+              <w:spacing w:after="20" w:line="252" w:lineRule="auto"/>
+            </w:pPr>
+            <w:r>
+              <w:rPr>
+                <w:b w:val="0"/>
+                <w:sz w:val="18"/>
+              </w:rPr>
+              <w:t>3.7</w:t>
+            </w:r>
+          </w:p>
+        </w:tc>
+      </w:tr>
+      <w:tr>
+        <w:tc>
+          <w:tcPr>
+            <w:tcW w:type="dxa" w:w="5616"/>
+            <w:vAlign w:val="center"/>
+            <w:tcBorders>
+              <w:top w:val="single" w:sz="4" w:color="D9D9D9"/>
+              <w:left w:val="single" w:sz="4" w:color="D9D9D9"/>
+              <w:bottom w:val="single" w:sz="4" w:color="D9D9D9"/>
+              <w:right w:val="single" w:sz="4" w:color="D9D9D9"/>
+            </w:tcBorders>
+            <w:shd w:fill="FFFFFF"/>
+            <w:tcMar>
+              <w:top w:w="75" w:type="dxa"/>
+              <w:left w:w="75" w:type="dxa"/>
+              <w:bottom w:w="75" w:type="dxa"/>
+              <w:right w:w="75" w:type="dxa"/>
+            </w:tcMar>
+          </w:tcPr>
+          <w:p>
+            <w:pPr>
+              <w:spacing w:after="20" w:line="252" w:lineRule="auto"/>
+            </w:pPr>
+            <w:r>
+              <w:rPr>
+                <w:b w:val="0"/>
+                <w:sz w:val="18"/>
+              </w:rPr>
+              <w:t>AI 교육콘텐츠 검수</w:t>
+            </w:r>
+          </w:p>
+        </w:tc>
+        <w:tc>
+          <w:tcPr>
+            <w:tcW w:type="dxa" w:w="1872"/>
+            <w:vAlign w:val="center"/>
+            <w:tcBorders>
+              <w:top w:val="single" w:sz="4" w:color="D9D9D9"/>
+              <w:left w:val="single" w:sz="4" w:color="D9D9D9"/>
+              <w:bottom w:val="single" w:sz="4" w:color="D9D9D9"/>
+              <w:right w:val="single" w:sz="4" w:color="D9D9D9"/>
+            </w:tcBorders>
+            <w:shd w:fill="FFFFFF"/>
+            <w:tcMar>
+              <w:top w:w="75" w:type="dxa"/>
+              <w:left w:w="75" w:type="dxa"/>
+              <w:bottom w:w="75" w:type="dxa"/>
+              <w:right w:w="75" w:type="dxa"/>
+            </w:tcMar>
+          </w:tcPr>
+          <w:p>
+            <w:pPr>
+              <w:spacing w:after="20" w:line="252" w:lineRule="auto"/>
+              <w:jc w:val="center"/>
+            </w:pPr>
+            <w:r>
+              <w:rPr>
+                <w:b w:val="0"/>
+                <w:sz w:val="18"/>
+              </w:rPr>
+              <w:t>6</w:t>
+            </w:r>
+          </w:p>
+        </w:tc>
+        <w:tc>
+          <w:tcPr>
+            <w:tcW w:type="dxa" w:w="2736"/>
+            <w:vAlign w:val="center"/>
+            <w:tcBorders>
+              <w:top w:val="single" w:sz="4" w:color="D9D9D9"/>
+              <w:left w:val="single" w:sz="4" w:color="D9D9D9"/>
+              <w:bottom w:val="single" w:sz="4" w:color="D9D9D9"/>
+              <w:right w:val="single" w:sz="4" w:color="D9D9D9"/>
+            </w:tcBorders>
+            <w:shd w:fill="FFFFFF"/>
+            <w:tcMar>
+              <w:top w:w="75" w:type="dxa"/>
+              <w:left w:w="75" w:type="dxa"/>
+              <w:bottom w:w="75" w:type="dxa"/>
+              <w:right w:w="75" w:type="dxa"/>
+            </w:tcMar>
+          </w:tcPr>
+          <w:p>
+            <w:pPr>
+              <w:spacing w:after="20" w:line="252" w:lineRule="auto"/>
+            </w:pPr>
+            <w:r>
+              <w:rPr>
+                <w:b w:val="0"/>
+                <w:sz w:val="18"/>
+              </w:rPr>
+              <w:t>3.0</w:t>
+            </w:r>
+          </w:p>
+        </w:tc>
+      </w:tr>
+      <w:tr>
+        <w:tc>
+          <w:tcPr>
+            <w:tcW w:type="dxa" w:w="5616"/>
+            <w:vAlign w:val="center"/>
+            <w:tcBorders>
+              <w:top w:val="single" w:sz="4" w:color="D9D9D9"/>
+              <w:left w:val="single" w:sz="4" w:color="D9D9D9"/>
+              <w:bottom w:val="single" w:sz="4" w:color="D9D9D9"/>
+              <w:right w:val="single" w:sz="4" w:color="D9D9D9"/>
+            </w:tcBorders>
+            <w:shd w:fill="FFFFFF"/>
+            <w:tcMar>
+              <w:top w:w="75" w:type="dxa"/>
+              <w:left w:w="75" w:type="dxa"/>
+              <w:bottom w:w="75" w:type="dxa"/>
+              <w:right w:w="75" w:type="dxa"/>
+            </w:tcMar>
+          </w:tcPr>
+          <w:p>
+            <w:pPr>
+              <w:spacing w:after="20" w:line="252" w:lineRule="auto"/>
+            </w:pPr>
+            <w:r>
+              <w:rPr>
+                <w:b w:val="0"/>
+                <w:sz w:val="18"/>
+              </w:rPr>
+              <w:t>AI 제작·운영 업무</w:t>
+            </w:r>
+          </w:p>
+        </w:tc>
+        <w:tc>
+          <w:tcPr>
+            <w:tcW w:type="dxa" w:w="1872"/>
+            <w:vAlign w:val="center"/>
+            <w:tcBorders>
+              <w:top w:val="single" w:sz="4" w:color="D9D9D9"/>
+              <w:left w:val="single" w:sz="4" w:color="D9D9D9"/>
+              <w:bottom w:val="single" w:sz="4" w:color="D9D9D9"/>
+              <w:right w:val="single" w:sz="4" w:color="D9D9D9"/>
+            </w:tcBorders>
+            <w:shd w:fill="FFFFFF"/>
+            <w:tcMar>
+              <w:top w:w="75" w:type="dxa"/>
+              <w:left w:w="75" w:type="dxa"/>
+              <w:bottom w:w="75" w:type="dxa"/>
+              <w:right w:w="75" w:type="dxa"/>
+            </w:tcMar>
+          </w:tcPr>
+          <w:p>
+            <w:pPr>
+              <w:spacing w:after="20" w:line="252" w:lineRule="auto"/>
+              <w:jc w:val="center"/>
+            </w:pPr>
+            <w:r>
+              <w:rPr>
+                <w:b w:val="0"/>
+                <w:sz w:val="18"/>
+              </w:rPr>
+              <w:t>8</w:t>
+            </w:r>
+          </w:p>
+        </w:tc>
+        <w:tc>
+          <w:tcPr>
+            <w:tcW w:type="dxa" w:w="2736"/>
+            <w:vAlign w:val="center"/>
+            <w:tcBorders>
+              <w:top w:val="single" w:sz="4" w:color="D9D9D9"/>
+              <w:left w:val="single" w:sz="4" w:color="D9D9D9"/>
+              <w:bottom w:val="single" w:sz="4" w:color="D9D9D9"/>
+              <w:right w:val="single" w:sz="4" w:color="D9D9D9"/>
+            </w:tcBorders>
+            <w:shd w:fill="FFFFFF"/>
+            <w:tcMar>
+              <w:top w:w="75" w:type="dxa"/>
+              <w:left w:w="75" w:type="dxa"/>
+              <w:bottom w:w="75" w:type="dxa"/>
+              <w:right w:w="75" w:type="dxa"/>
+            </w:tcMar>
+          </w:tcPr>
+          <w:p>
+            <w:pPr>
+              <w:spacing w:after="20" w:line="252" w:lineRule="auto"/>
+            </w:pPr>
+            <w:r>
+              <w:rPr>
+                <w:b w:val="0"/>
+                <w:sz w:val="18"/>
+              </w:rPr>
+              <w:t>4.0</w:t>
+            </w:r>
+          </w:p>
+        </w:tc>
+      </w:tr>
+      <w:tr>
+        <w:tc>
+          <w:tcPr>
+            <w:tcW w:type="dxa" w:w="5616"/>
+            <w:vAlign w:val="center"/>
+            <w:tcBorders>
+              <w:top w:val="single" w:sz="4" w:color="D9D9D9"/>
+              <w:left w:val="single" w:sz="4" w:color="D9D9D9"/>
+              <w:bottom w:val="single" w:sz="4" w:color="D9D9D9"/>
+              <w:right w:val="single" w:sz="4" w:color="D9D9D9"/>
+            </w:tcBorders>
+            <w:shd w:fill="FFFFFF"/>
+            <w:tcMar>
+              <w:top w:w="75" w:type="dxa"/>
+              <w:left w:w="75" w:type="dxa"/>
+              <w:bottom w:w="75" w:type="dxa"/>
+              <w:right w:w="75" w:type="dxa"/>
+            </w:tcMar>
+          </w:tcPr>
+          <w:p>
+            <w:pPr>
+              <w:spacing w:after="20" w:line="252" w:lineRule="auto"/>
+            </w:pPr>
+            <w:r>
+              <w:rPr>
+                <w:b w:val="0"/>
+                <w:sz w:val="18"/>
+              </w:rPr>
+              <w:t>AI 고객응대 실무</w:t>
+            </w:r>
+          </w:p>
+        </w:tc>
+        <w:tc>
+          <w:tcPr>
+            <w:tcW w:type="dxa" w:w="1872"/>
+            <w:vAlign w:val="center"/>
+            <w:tcBorders>
+              <w:top w:val="single" w:sz="4" w:color="D9D9D9"/>
+              <w:left w:val="single" w:sz="4" w:color="D9D9D9"/>
+              <w:bottom w:val="single" w:sz="4" w:color="D9D9D9"/>
+              <w:right w:val="single" w:sz="4" w:color="D9D9D9"/>
+            </w:tcBorders>
+            <w:shd w:fill="FFFFFF"/>
+            <w:tcMar>
+              <w:top w:w="75" w:type="dxa"/>
+              <w:left w:w="75" w:type="dxa"/>
+              <w:bottom w:w="75" w:type="dxa"/>
+              <w:right w:w="75" w:type="dxa"/>
+            </w:tcMar>
+          </w:tcPr>
+          <w:p>
+            <w:pPr>
+              <w:spacing w:after="20" w:line="252" w:lineRule="auto"/>
+              <w:jc w:val="center"/>
+            </w:pPr>
+            <w:r>
+              <w:rPr>
+                <w:b w:val="0"/>
+                <w:sz w:val="18"/>
+              </w:rPr>
+              <w:t>6</w:t>
+            </w:r>
+          </w:p>
+        </w:tc>
+        <w:tc>
+          <w:tcPr>
+            <w:tcW w:type="dxa" w:w="2736"/>
+            <w:vAlign w:val="center"/>
+            <w:tcBorders>
+              <w:top w:val="single" w:sz="4" w:color="D9D9D9"/>
+              <w:left w:val="single" w:sz="4" w:color="D9D9D9"/>
+              <w:bottom w:val="single" w:sz="4" w:color="D9D9D9"/>
+              <w:right w:val="single" w:sz="4" w:color="D9D9D9"/>
+            </w:tcBorders>
+            <w:shd w:fill="FFFFFF"/>
+            <w:tcMar>
+              <w:top w:w="75" w:type="dxa"/>
+              <w:left w:w="75" w:type="dxa"/>
+              <w:bottom w:w="75" w:type="dxa"/>
+              <w:right w:w="75" w:type="dxa"/>
+            </w:tcMar>
+          </w:tcPr>
+          <w:p>
+            <w:pPr>
+              <w:spacing w:after="20" w:line="252" w:lineRule="auto"/>
+            </w:pPr>
+            <w:r>
+              <w:rPr>
+                <w:b w:val="0"/>
+                <w:sz w:val="18"/>
+              </w:rPr>
+              <w:t>4.3</w:t>
+            </w:r>
+          </w:p>
+        </w:tc>
+      </w:tr>
+    </w:tbl>
+    <w:p>
+      <w:r>
+        <w:br w:type="page"/>
       </w:r>
     </w:p>
     <w:p>
       <w:pPr>
-        <w:ind w:left="283"/>
+        <w:pStyle w:val="Heading1"/>
       </w:pPr>
       <w:r>
-        <w:rPr>
-          <w:rFonts w:ascii="맑은 고딕" w:hAnsi="맑은 고딕" w:eastAsia="맑은 고딕"/>
-          <w:b w:val="0"/>
-        </w:rPr>
-        <w:t>• 대상: 2026 하반기 직원 역량개발 연수 6개 과정 참여자</w:t>
-      </w:r>
-    </w:p>
-    <w:p>
-      <w:pPr>
-        <w:ind w:left="283"/>
-      </w:pPr>
-      <w:r>
-        <w:rPr>
-          <w:rFonts w:ascii="맑은 고딕" w:hAnsi="맑은 고딕" w:eastAsia="맑은 고딕"/>
-          <w:b w:val="0"/>
-        </w:rPr>
-        <w:t>• 응답: 72명 (설문 기간 중 온라인 제출)</w:t>
-      </w:r>
-    </w:p>
-    <w:p>
-      <w:pPr>
-        <w:ind w:left="283"/>
-      </w:pPr>
-      <w:r>
-        <w:rPr>
-          <w:rFonts w:ascii="맑은 고딕" w:hAnsi="맑은 고딕" w:eastAsia="맑은 고딕"/>
-          <w:b w:val="0"/>
-        </w:rPr>
-        <w:t>• 문항: 5점 척도 5문항(전반 만족도·내용 구성·실무 적용 가능성·교육 환경·추천 의향) + 재참여 의향 + 자유 의견</w:t>
-      </w:r>
-    </w:p>
-    <w:p>
-      <w:pPr>
-        <w:spacing w:before="200"/>
-      </w:pPr>
-      <w:r>
-        <w:rPr>
-          <w:rFonts w:ascii="맑은 고딕" w:hAnsi="맑은 고딕" w:eastAsia="맑은 고딕"/>
-          <w:b/>
-          <w:color w:val="153C78"/>
-          <w:sz w:val="24"/>
-        </w:rPr>
-        <w:t>2. 핵심 수치</w:t>
-      </w:r>
-    </w:p>
-    <w:p>
-      <w:pPr>
-        <w:ind w:left="283"/>
-      </w:pPr>
-      <w:r>
-        <w:rPr>
-          <w:rFonts w:ascii="맑은 고딕" w:hAnsi="맑은 고딕" w:eastAsia="맑은 고딕"/>
-          <w:b w:val="0"/>
-        </w:rPr>
-        <w:t xml:space="preserve">• 전반 만족도 평균 </w:t>
-      </w:r>
-      <w:r>
-        <w:rPr>
-          <w:rFonts w:ascii="맑은 고딕" w:hAnsi="맑은 고딕" w:eastAsia="맑은 고딕"/>
-          <w:b/>
-        </w:rPr>
-        <w:t>4.0점</w:t>
-      </w:r>
-      <w:r>
-        <w:rPr>
-          <w:rFonts w:ascii="맑은 고딕" w:hAnsi="맑은 고딕" w:eastAsia="맑은 고딕"/>
-          <w:b w:val="0"/>
-        </w:rPr>
-        <w:t xml:space="preserve"> — 전체적으로 양호</w:t>
-      </w:r>
-    </w:p>
-    <w:p>
-      <w:pPr>
-        <w:ind w:left="283"/>
-      </w:pPr>
-      <w:r>
-        <w:rPr>
-          <w:rFonts w:ascii="맑은 고딕" w:hAnsi="맑은 고딕" w:eastAsia="맑은 고딕"/>
-          <w:b w:val="0"/>
-        </w:rPr>
-        <w:t xml:space="preserve">• 문항별 최고: </w:t>
-      </w:r>
-      <w:r>
-        <w:rPr>
-          <w:rFonts w:ascii="맑은 고딕" w:hAnsi="맑은 고딕" w:eastAsia="맑은 고딕"/>
-          <w:b/>
-        </w:rPr>
-        <w:t>실무 적용 가능성 4.3점</w:t>
-      </w:r>
-      <w:r>
-        <w:rPr>
-          <w:rFonts w:ascii="맑은 고딕" w:hAnsi="맑은 고딕" w:eastAsia="맑은 고딕"/>
-          <w:b w:val="0"/>
-        </w:rPr>
-        <w:t xml:space="preserve"> (참여자들이 가장 높게 평가)</w:t>
-      </w:r>
-    </w:p>
-    <w:p>
-      <w:pPr>
-        <w:ind w:left="283"/>
-      </w:pPr>
-      <w:r>
-        <w:rPr>
-          <w:rFonts w:ascii="맑은 고딕" w:hAnsi="맑은 고딕" w:eastAsia="맑은 고딕"/>
-          <w:b w:val="0"/>
-        </w:rPr>
-        <w:t xml:space="preserve">• 문항별 최저: </w:t>
-      </w:r>
-      <w:r>
-        <w:rPr>
-          <w:rFonts w:ascii="맑은 고딕" w:hAnsi="맑은 고딕" w:eastAsia="맑은 고딕"/>
-          <w:b/>
-        </w:rPr>
-        <w:t>교육 환경 3.1점</w:t>
-      </w:r>
-      <w:r>
-        <w:rPr>
-          <w:rFonts w:ascii="맑은 고딕" w:hAnsi="맑은 고딕" w:eastAsia="맑은 고딕"/>
-          <w:b w:val="0"/>
-        </w:rPr>
-        <w:t xml:space="preserve"> (전 과정 공통으로 낮음 — 시설·장비 요인)</w:t>
-      </w:r>
-    </w:p>
-    <w:p>
-      <w:pPr>
-        <w:ind w:left="283"/>
-      </w:pPr>
-      <w:r>
-        <w:rPr>
-          <w:rFonts w:ascii="맑은 고딕" w:hAnsi="맑은 고딕" w:eastAsia="맑은 고딕"/>
-          <w:b w:val="0"/>
-        </w:rPr>
-        <w:t xml:space="preserve">• 과정별 최고: </w:t>
-      </w:r>
-      <w:r>
-        <w:rPr>
-          <w:rFonts w:ascii="맑은 고딕" w:hAnsi="맑은 고딕" w:eastAsia="맑은 고딕"/>
-          <w:b/>
-        </w:rPr>
-        <w:t>AI 활용 실무 4.5점</w:t>
-      </w:r>
-      <w:r>
-        <w:rPr>
-          <w:rFonts w:ascii="맑은 고딕" w:hAnsi="맑은 고딕" w:eastAsia="맑은 고딕"/>
-          <w:b w:val="0"/>
-        </w:rPr>
-        <w:t xml:space="preserve"> (26명 참여, 최다 인원·최고 만족)</w:t>
-      </w:r>
-    </w:p>
-    <w:p>
-      <w:pPr>
-        <w:ind w:left="283"/>
-      </w:pPr>
-      <w:r>
-        <w:rPr>
-          <w:rFonts w:ascii="맑은 고딕" w:hAnsi="맑은 고딕" w:eastAsia="맑은 고딕"/>
-          <w:b w:val="0"/>
-        </w:rPr>
-        <w:t>• 과정별 하위: 정보보안 실무 3.0점 · 비즈니스 문서 작성 심화 3.7점 (내용 구성 문항도 동반 하락)</w:t>
-      </w:r>
-    </w:p>
-    <w:p>
-      <w:pPr>
-        <w:spacing w:before="200"/>
-      </w:pPr>
-      <w:r>
-        <w:rPr>
-          <w:rFonts w:ascii="맑은 고딕" w:hAnsi="맑은 고딕" w:eastAsia="맑은 고딕"/>
-          <w:b/>
-          <w:color w:val="153C78"/>
-          <w:sz w:val="24"/>
-        </w:rPr>
         <w:t>3. 자유 의견 분석 (38건)</w:t>
       </w:r>
     </w:p>
     <w:tbl>
       <w:tblPr>
-        <w:tblStyle w:val="TableGrid"/>
         <w:tblW w:type="auto" w:w="0"/>
+        <w:tblLayout w:type="fixed"/>
         <w:tblLook w:firstColumn="1" w:firstRow="1" w:lastColumn="0" w:lastRow="0" w:noHBand="0" w:noVBand="1" w:val="04A0"/>
       </w:tblPr>
       <w:tblGrid>
-        <w:gridCol w:w="3249"/>
-        <w:gridCol w:w="3249"/>
-        <w:gridCol w:w="3249"/>
+        <w:gridCol w:w="3408"/>
+        <w:gridCol w:w="3408"/>
+        <w:gridCol w:w="3408"/>
       </w:tblGrid>
       <w:tr>
+        <w:trPr>
+          <w:tblHeader/>
+        </w:trPr>
         <w:tc>
           <w:tcPr>
-            <w:tcW w:type="dxa" w:w="3249"/>
+            <w:tcW w:type="dxa" w:w="1800"/>
+            <w:vAlign w:val="center"/>
+            <w:tcBorders>
+              <w:top w:val="single" w:sz="4" w:color="D9D9D9"/>
+              <w:left w:val="single" w:sz="4" w:color="D9D9D9"/>
+              <w:bottom w:val="single" w:sz="4" w:color="D9D9D9"/>
+              <w:right w:val="single" w:sz="4" w:color="D9D9D9"/>
+            </w:tcBorders>
+            <w:shd w:fill="DCE6F1"/>
+            <w:tcMar>
+              <w:top w:w="75" w:type="dxa"/>
+              <w:left w:w="75" w:type="dxa"/>
+              <w:bottom w:w="75" w:type="dxa"/>
+              <w:right w:w="75" w:type="dxa"/>
+            </w:tcMar>
           </w:tcPr>
           <w:p>
-            <w:r/>
+            <w:pPr>
+              <w:spacing w:after="20" w:line="252" w:lineRule="auto"/>
+            </w:pPr>
             <w:r>
               <w:rPr>
-                <w:rFonts w:ascii="맑은 고딕" w:hAnsi="맑은 고딕" w:eastAsia="맑은 고딕"/>
                 <w:b/>
-                <w:color w:val="153C78"/>
-                <w:sz w:val="19"/>
+                <w:sz w:val="18"/>
               </w:rPr>
               <w:t>유형</w:t>
             </w:r>
@@ -295,16 +817,31 @@
         </w:tc>
         <w:tc>
           <w:tcPr>
-            <w:tcW w:type="dxa" w:w="3249"/>
+            <w:tcW w:type="dxa" w:w="720"/>
+            <w:vAlign w:val="center"/>
+            <w:tcBorders>
+              <w:top w:val="single" w:sz="4" w:color="D9D9D9"/>
+              <w:left w:val="single" w:sz="4" w:color="D9D9D9"/>
+              <w:bottom w:val="single" w:sz="4" w:color="D9D9D9"/>
+              <w:right w:val="single" w:sz="4" w:color="D9D9D9"/>
+            </w:tcBorders>
+            <w:shd w:fill="DCE6F1"/>
+            <w:tcMar>
+              <w:top w:w="75" w:type="dxa"/>
+              <w:left w:w="75" w:type="dxa"/>
+              <w:bottom w:w="75" w:type="dxa"/>
+              <w:right w:w="75" w:type="dxa"/>
+            </w:tcMar>
           </w:tcPr>
           <w:p>
-            <w:r/>
+            <w:pPr>
+              <w:spacing w:after="20" w:line="252" w:lineRule="auto"/>
+              <w:jc w:val="center"/>
+            </w:pPr>
             <w:r>
               <w:rPr>
-                <w:rFonts w:ascii="맑은 고딕" w:hAnsi="맑은 고딕" w:eastAsia="맑은 고딕"/>
                 <w:b/>
-                <w:color w:val="153C78"/>
-                <w:sz w:val="19"/>
+                <w:sz w:val="18"/>
               </w:rPr>
               <w:t>건수</w:t>
             </w:r>
@@ -312,16 +849,30 @@
         </w:tc>
         <w:tc>
           <w:tcPr>
-            <w:tcW w:type="dxa" w:w="3249"/>
+            <w:tcW w:type="dxa" w:w="7704"/>
+            <w:vAlign w:val="center"/>
+            <w:tcBorders>
+              <w:top w:val="single" w:sz="4" w:color="D9D9D9"/>
+              <w:left w:val="single" w:sz="4" w:color="D9D9D9"/>
+              <w:bottom w:val="single" w:sz="4" w:color="D9D9D9"/>
+              <w:right w:val="single" w:sz="4" w:color="D9D9D9"/>
+            </w:tcBorders>
+            <w:shd w:fill="DCE6F1"/>
+            <w:tcMar>
+              <w:top w:w="75" w:type="dxa"/>
+              <w:left w:w="75" w:type="dxa"/>
+              <w:bottom w:w="75" w:type="dxa"/>
+              <w:right w:w="75" w:type="dxa"/>
+            </w:tcMar>
           </w:tcPr>
           <w:p>
-            <w:r/>
+            <w:pPr>
+              <w:spacing w:after="20" w:line="252" w:lineRule="auto"/>
+            </w:pPr>
             <w:r>
               <w:rPr>
-                <w:rFonts w:ascii="맑은 고딕" w:hAnsi="맑은 고딕" w:eastAsia="맑은 고딕"/>
                 <w:b/>
-                <w:color w:val="153C78"/>
-                <w:sz w:val="19"/>
+                <w:sz w:val="18"/>
               </w:rPr>
               <w:t>대표 의견</w:t>
             </w:r>
@@ -331,49 +882,95 @@
       <w:tr>
         <w:tc>
           <w:tcPr>
-            <w:tcW w:type="dxa" w:w="3249"/>
+            <w:tcW w:type="dxa" w:w="1800"/>
+            <w:vAlign w:val="center"/>
+            <w:tcBorders>
+              <w:top w:val="single" w:sz="4" w:color="D9D9D9"/>
+              <w:left w:val="single" w:sz="4" w:color="D9D9D9"/>
+              <w:bottom w:val="single" w:sz="4" w:color="D9D9D9"/>
+              <w:right w:val="single" w:sz="4" w:color="D9D9D9"/>
+            </w:tcBorders>
+            <w:shd w:fill="FFFFFF"/>
+            <w:tcMar>
+              <w:top w:w="75" w:type="dxa"/>
+              <w:left w:w="75" w:type="dxa"/>
+              <w:bottom w:w="75" w:type="dxa"/>
+              <w:right w:w="75" w:type="dxa"/>
+            </w:tcMar>
           </w:tcPr>
           <w:p>
-            <w:r/>
+            <w:pPr>
+              <w:spacing w:after="20" w:line="252" w:lineRule="auto"/>
+            </w:pPr>
             <w:r>
               <w:rPr>
-                <w:rFonts w:ascii="맑은 고딕" w:hAnsi="맑은 고딕" w:eastAsia="맑은 고딕"/>
                 <w:b w:val="0"/>
-                <w:sz w:val="19"/>
+                <w:sz w:val="18"/>
               </w:rPr>
-              <w:t>실습 시간 부족</w:t>
+              <w:t>실습 시간 확대</w:t>
             </w:r>
           </w:p>
         </w:tc>
         <w:tc>
           <w:tcPr>
-            <w:tcW w:type="dxa" w:w="3249"/>
+            <w:tcW w:type="dxa" w:w="720"/>
+            <w:vAlign w:val="center"/>
+            <w:tcBorders>
+              <w:top w:val="single" w:sz="4" w:color="D9D9D9"/>
+              <w:left w:val="single" w:sz="4" w:color="D9D9D9"/>
+              <w:bottom w:val="single" w:sz="4" w:color="D9D9D9"/>
+              <w:right w:val="single" w:sz="4" w:color="D9D9D9"/>
+            </w:tcBorders>
+            <w:shd w:fill="FFFFFF"/>
+            <w:tcMar>
+              <w:top w:w="75" w:type="dxa"/>
+              <w:left w:w="75" w:type="dxa"/>
+              <w:bottom w:w="75" w:type="dxa"/>
+              <w:right w:w="75" w:type="dxa"/>
+            </w:tcMar>
           </w:tcPr>
           <w:p>
-            <w:r/>
+            <w:pPr>
+              <w:spacing w:after="20" w:line="252" w:lineRule="auto"/>
+              <w:jc w:val="center"/>
+            </w:pPr>
             <w:r>
               <w:rPr>
-                <w:rFonts w:ascii="맑은 고딕" w:hAnsi="맑은 고딕" w:eastAsia="맑은 고딕"/>
                 <w:b w:val="0"/>
-                <w:sz w:val="19"/>
+                <w:sz w:val="18"/>
               </w:rPr>
-              <w:t>11건</w:t>
+              <w:t>11</w:t>
             </w:r>
           </w:p>
         </w:tc>
         <w:tc>
           <w:tcPr>
-            <w:tcW w:type="dxa" w:w="3249"/>
+            <w:tcW w:type="dxa" w:w="7704"/>
+            <w:vAlign w:val="center"/>
+            <w:tcBorders>
+              <w:top w:val="single" w:sz="4" w:color="D9D9D9"/>
+              <w:left w:val="single" w:sz="4" w:color="D9D9D9"/>
+              <w:bottom w:val="single" w:sz="4" w:color="D9D9D9"/>
+              <w:right w:val="single" w:sz="4" w:color="D9D9D9"/>
+            </w:tcBorders>
+            <w:shd w:fill="FFFFFF"/>
+            <w:tcMar>
+              <w:top w:w="75" w:type="dxa"/>
+              <w:left w:w="75" w:type="dxa"/>
+              <w:bottom w:w="75" w:type="dxa"/>
+              <w:right w:w="75" w:type="dxa"/>
+            </w:tcMar>
           </w:tcPr>
           <w:p>
-            <w:r/>
+            <w:pPr>
+              <w:spacing w:after="20" w:line="252" w:lineRule="auto"/>
+            </w:pPr>
             <w:r>
               <w:rPr>
-                <w:rFonts w:ascii="맑은 고딕" w:hAnsi="맑은 고딕" w:eastAsia="맑은 고딕"/>
                 <w:b w:val="0"/>
-                <w:sz w:val="19"/>
+                <w:sz w:val="18"/>
               </w:rPr>
-              <w:t>"따라 하다 보면 끝나 있어요" — 대부분 AI·데이터 과정에 집중</w:t>
+              <w:t>“프롬프트를 업무에 맞게 수정하는 실습 시간이 부족했습니다. 직접 따라 할 시간을 늘려주세요.”</w:t>
             </w:r>
           </w:p>
         </w:tc>
@@ -381,49 +978,95 @@
       <w:tr>
         <w:tc>
           <w:tcPr>
-            <w:tcW w:type="dxa" w:w="3249"/>
+            <w:tcW w:type="dxa" w:w="1800"/>
+            <w:vAlign w:val="center"/>
+            <w:tcBorders>
+              <w:top w:val="single" w:sz="4" w:color="D9D9D9"/>
+              <w:left w:val="single" w:sz="4" w:color="D9D9D9"/>
+              <w:bottom w:val="single" w:sz="4" w:color="D9D9D9"/>
+              <w:right w:val="single" w:sz="4" w:color="D9D9D9"/>
+            </w:tcBorders>
+            <w:shd w:fill="FFFFFF"/>
+            <w:tcMar>
+              <w:top w:w="75" w:type="dxa"/>
+              <w:left w:w="75" w:type="dxa"/>
+              <w:bottom w:w="75" w:type="dxa"/>
+              <w:right w:w="75" w:type="dxa"/>
+            </w:tcMar>
           </w:tcPr>
           <w:p>
-            <w:r/>
+            <w:pPr>
+              <w:spacing w:after="20" w:line="252" w:lineRule="auto"/>
+            </w:pPr>
             <w:r>
               <w:rPr>
-                <w:rFonts w:ascii="맑은 고딕" w:hAnsi="맑은 고딕" w:eastAsia="맑은 고딕"/>
                 <w:b w:val="0"/>
-                <w:sz w:val="19"/>
+                <w:sz w:val="18"/>
               </w:rPr>
-              <w:t>교육 환경 불만</w:t>
+              <w:t>교육 환경 개선</w:t>
             </w:r>
           </w:p>
         </w:tc>
         <w:tc>
           <w:tcPr>
-            <w:tcW w:type="dxa" w:w="3249"/>
+            <w:tcW w:type="dxa" w:w="720"/>
+            <w:vAlign w:val="center"/>
+            <w:tcBorders>
+              <w:top w:val="single" w:sz="4" w:color="D9D9D9"/>
+              <w:left w:val="single" w:sz="4" w:color="D9D9D9"/>
+              <w:bottom w:val="single" w:sz="4" w:color="D9D9D9"/>
+              <w:right w:val="single" w:sz="4" w:color="D9D9D9"/>
+            </w:tcBorders>
+            <w:shd w:fill="FFFFFF"/>
+            <w:tcMar>
+              <w:top w:w="75" w:type="dxa"/>
+              <w:left w:w="75" w:type="dxa"/>
+              <w:bottom w:w="75" w:type="dxa"/>
+              <w:right w:w="75" w:type="dxa"/>
+            </w:tcMar>
           </w:tcPr>
           <w:p>
-            <w:r/>
+            <w:pPr>
+              <w:spacing w:after="20" w:line="252" w:lineRule="auto"/>
+              <w:jc w:val="center"/>
+            </w:pPr>
             <w:r>
               <w:rPr>
-                <w:rFonts w:ascii="맑은 고딕" w:hAnsi="맑은 고딕" w:eastAsia="맑은 고딕"/>
                 <w:b w:val="0"/>
-                <w:sz w:val="19"/>
+                <w:sz w:val="18"/>
               </w:rPr>
-              <w:t>8건</w:t>
+              <w:t>8</w:t>
             </w:r>
           </w:p>
         </w:tc>
         <w:tc>
           <w:tcPr>
-            <w:tcW w:type="dxa" w:w="3249"/>
+            <w:tcW w:type="dxa" w:w="7704"/>
+            <w:vAlign w:val="center"/>
+            <w:tcBorders>
+              <w:top w:val="single" w:sz="4" w:color="D9D9D9"/>
+              <w:left w:val="single" w:sz="4" w:color="D9D9D9"/>
+              <w:bottom w:val="single" w:sz="4" w:color="D9D9D9"/>
+              <w:right w:val="single" w:sz="4" w:color="D9D9D9"/>
+            </w:tcBorders>
+            <w:shd w:fill="FFFFFF"/>
+            <w:tcMar>
+              <w:top w:w="75" w:type="dxa"/>
+              <w:left w:w="75" w:type="dxa"/>
+              <w:bottom w:w="75" w:type="dxa"/>
+              <w:right w:w="75" w:type="dxa"/>
+            </w:tcMar>
           </w:tcPr>
           <w:p>
-            <w:r/>
+            <w:pPr>
+              <w:spacing w:after="20" w:line="252" w:lineRule="auto"/>
+            </w:pPr>
             <w:r>
               <w:rPr>
-                <w:rFonts w:ascii="맑은 고딕" w:hAnsi="맑은 고딕" w:eastAsia="맑은 고딕"/>
                 <w:b w:val="0"/>
-                <w:sz w:val="19"/>
+                <w:sz w:val="18"/>
               </w:rPr>
-              <w:t>교육장 PC 속도·화면 크기·네트워크</w:t>
+              <w:t>“의자가 불편하고 실내가 더웠습니다.”</w:t>
             </w:r>
           </w:p>
         </w:tc>
@@ -431,15 +1074,30 @@
       <w:tr>
         <w:tc>
           <w:tcPr>
-            <w:tcW w:type="dxa" w:w="3249"/>
+            <w:tcW w:type="dxa" w:w="1800"/>
+            <w:vAlign w:val="center"/>
+            <w:tcBorders>
+              <w:top w:val="single" w:sz="4" w:color="D9D9D9"/>
+              <w:left w:val="single" w:sz="4" w:color="D9D9D9"/>
+              <w:bottom w:val="single" w:sz="4" w:color="D9D9D9"/>
+              <w:right w:val="single" w:sz="4" w:color="D9D9D9"/>
+            </w:tcBorders>
+            <w:shd w:fill="FFFFFF"/>
+            <w:tcMar>
+              <w:top w:w="75" w:type="dxa"/>
+              <w:left w:w="75" w:type="dxa"/>
+              <w:bottom w:w="75" w:type="dxa"/>
+              <w:right w:w="75" w:type="dxa"/>
+            </w:tcMar>
           </w:tcPr>
           <w:p>
-            <w:r/>
+            <w:pPr>
+              <w:spacing w:after="20" w:line="252" w:lineRule="auto"/>
+            </w:pPr>
             <w:r>
               <w:rPr>
-                <w:rFonts w:ascii="맑은 고딕" w:hAnsi="맑은 고딕" w:eastAsia="맑은 고딕"/>
                 <w:b w:val="0"/>
-                <w:sz w:val="19"/>
+                <w:sz w:val="18"/>
               </w:rPr>
               <w:t>긍정 평가</w:t>
             </w:r>
@@ -447,33 +1105,64 @@
         </w:tc>
         <w:tc>
           <w:tcPr>
-            <w:tcW w:type="dxa" w:w="3249"/>
+            <w:tcW w:type="dxa" w:w="720"/>
+            <w:vAlign w:val="center"/>
+            <w:tcBorders>
+              <w:top w:val="single" w:sz="4" w:color="D9D9D9"/>
+              <w:left w:val="single" w:sz="4" w:color="D9D9D9"/>
+              <w:bottom w:val="single" w:sz="4" w:color="D9D9D9"/>
+              <w:right w:val="single" w:sz="4" w:color="D9D9D9"/>
+            </w:tcBorders>
+            <w:shd w:fill="FFFFFF"/>
+            <w:tcMar>
+              <w:top w:w="75" w:type="dxa"/>
+              <w:left w:w="75" w:type="dxa"/>
+              <w:bottom w:w="75" w:type="dxa"/>
+              <w:right w:w="75" w:type="dxa"/>
+            </w:tcMar>
           </w:tcPr>
           <w:p>
-            <w:r/>
+            <w:pPr>
+              <w:spacing w:after="20" w:line="252" w:lineRule="auto"/>
+              <w:jc w:val="center"/>
+            </w:pPr>
             <w:r>
               <w:rPr>
-                <w:rFonts w:ascii="맑은 고딕" w:hAnsi="맑은 고딕" w:eastAsia="맑은 고딕"/>
                 <w:b w:val="0"/>
-                <w:sz w:val="19"/>
+                <w:sz w:val="18"/>
               </w:rPr>
-              <w:t>8건</w:t>
+              <w:t>8</w:t>
             </w:r>
           </w:p>
         </w:tc>
         <w:tc>
           <w:tcPr>
-            <w:tcW w:type="dxa" w:w="3249"/>
+            <w:tcW w:type="dxa" w:w="7704"/>
+            <w:vAlign w:val="center"/>
+            <w:tcBorders>
+              <w:top w:val="single" w:sz="4" w:color="D9D9D9"/>
+              <w:left w:val="single" w:sz="4" w:color="D9D9D9"/>
+              <w:bottom w:val="single" w:sz="4" w:color="D9D9D9"/>
+              <w:right w:val="single" w:sz="4" w:color="D9D9D9"/>
+            </w:tcBorders>
+            <w:shd w:fill="FFFFFF"/>
+            <w:tcMar>
+              <w:top w:w="75" w:type="dxa"/>
+              <w:left w:w="75" w:type="dxa"/>
+              <w:bottom w:w="75" w:type="dxa"/>
+              <w:right w:w="75" w:type="dxa"/>
+            </w:tcMar>
           </w:tcPr>
           <w:p>
-            <w:r/>
+            <w:pPr>
+              <w:spacing w:after="20" w:line="252" w:lineRule="auto"/>
+            </w:pPr>
             <w:r>
               <w:rPr>
-                <w:rFonts w:ascii="맑은 고딕" w:hAnsi="맑은 고딕" w:eastAsia="맑은 고딕"/>
                 <w:b w:val="0"/>
-                <w:sz w:val="19"/>
+                <w:sz w:val="18"/>
               </w:rPr>
-              <w:t>"바로 업무에 써먹을 수 있다"</w:t>
+              <w:t>“제작·운영 데이터를 정리하는 실습이 실제 업무를 떠올리며 배우는 데 도움이 됐습니다.”</w:t>
             </w:r>
           </w:p>
         </w:tc>
@@ -481,15 +1170,30 @@
       <w:tr>
         <w:tc>
           <w:tcPr>
-            <w:tcW w:type="dxa" w:w="3249"/>
+            <w:tcW w:type="dxa" w:w="1800"/>
+            <w:vAlign w:val="center"/>
+            <w:tcBorders>
+              <w:top w:val="single" w:sz="4" w:color="D9D9D9"/>
+              <w:left w:val="single" w:sz="4" w:color="D9D9D9"/>
+              <w:bottom w:val="single" w:sz="4" w:color="D9D9D9"/>
+              <w:right w:val="single" w:sz="4" w:color="D9D9D9"/>
+            </w:tcBorders>
+            <w:shd w:fill="FFFFFF"/>
+            <w:tcMar>
+              <w:top w:w="75" w:type="dxa"/>
+              <w:left w:w="75" w:type="dxa"/>
+              <w:bottom w:w="75" w:type="dxa"/>
+              <w:right w:w="75" w:type="dxa"/>
+            </w:tcMar>
           </w:tcPr>
           <w:p>
-            <w:r/>
+            <w:pPr>
+              <w:spacing w:after="20" w:line="252" w:lineRule="auto"/>
+            </w:pPr>
             <w:r>
               <w:rPr>
-                <w:rFonts w:ascii="맑은 고딕" w:hAnsi="맑은 고딕" w:eastAsia="맑은 고딕"/>
                 <w:b w:val="0"/>
-                <w:sz w:val="19"/>
+                <w:sz w:val="18"/>
               </w:rPr>
               <w:t>심화 과정 요청</w:t>
             </w:r>
@@ -497,33 +1201,64 @@
         </w:tc>
         <w:tc>
           <w:tcPr>
-            <w:tcW w:type="dxa" w:w="3249"/>
+            <w:tcW w:type="dxa" w:w="720"/>
+            <w:vAlign w:val="center"/>
+            <w:tcBorders>
+              <w:top w:val="single" w:sz="4" w:color="D9D9D9"/>
+              <w:left w:val="single" w:sz="4" w:color="D9D9D9"/>
+              <w:bottom w:val="single" w:sz="4" w:color="D9D9D9"/>
+              <w:right w:val="single" w:sz="4" w:color="D9D9D9"/>
+            </w:tcBorders>
+            <w:shd w:fill="FFFFFF"/>
+            <w:tcMar>
+              <w:top w:w="75" w:type="dxa"/>
+              <w:left w:w="75" w:type="dxa"/>
+              <w:bottom w:w="75" w:type="dxa"/>
+              <w:right w:w="75" w:type="dxa"/>
+            </w:tcMar>
           </w:tcPr>
           <w:p>
-            <w:r/>
+            <w:pPr>
+              <w:spacing w:after="20" w:line="252" w:lineRule="auto"/>
+              <w:jc w:val="center"/>
+            </w:pPr>
             <w:r>
               <w:rPr>
-                <w:rFonts w:ascii="맑은 고딕" w:hAnsi="맑은 고딕" w:eastAsia="맑은 고딕"/>
                 <w:b w:val="0"/>
-                <w:sz w:val="19"/>
+                <w:sz w:val="18"/>
               </w:rPr>
-              <w:t>6건</w:t>
+              <w:t>6</w:t>
             </w:r>
           </w:p>
         </w:tc>
         <w:tc>
           <w:tcPr>
-            <w:tcW w:type="dxa" w:w="3249"/>
+            <w:tcW w:type="dxa" w:w="7704"/>
+            <w:vAlign w:val="center"/>
+            <w:tcBorders>
+              <w:top w:val="single" w:sz="4" w:color="D9D9D9"/>
+              <w:left w:val="single" w:sz="4" w:color="D9D9D9"/>
+              <w:bottom w:val="single" w:sz="4" w:color="D9D9D9"/>
+              <w:right w:val="single" w:sz="4" w:color="D9D9D9"/>
+            </w:tcBorders>
+            <w:shd w:fill="FFFFFF"/>
+            <w:tcMar>
+              <w:top w:w="75" w:type="dxa"/>
+              <w:left w:w="75" w:type="dxa"/>
+              <w:bottom w:w="75" w:type="dxa"/>
+              <w:right w:w="75" w:type="dxa"/>
+            </w:tcMar>
           </w:tcPr>
           <w:p>
-            <w:r/>
+            <w:pPr>
+              <w:spacing w:after="20" w:line="252" w:lineRule="auto"/>
+            </w:pPr>
             <w:r>
               <w:rPr>
-                <w:rFonts w:ascii="맑은 고딕" w:hAnsi="맑은 고딕" w:eastAsia="맑은 고딕"/>
                 <w:b w:val="0"/>
-                <w:sz w:val="19"/>
+                <w:sz w:val="18"/>
               </w:rPr>
-              <w:t>AI 과정 후속·시리즈 과정 개설 요구</w:t>
+              <w:t>“AI 업무 기본 후속 과정을 열어 직무 사례를 더 깊게 다루면 좋겠습니다.”</w:t>
             </w:r>
           </w:p>
         </w:tc>
@@ -531,264 +1266,164 @@
       <w:tr>
         <w:tc>
           <w:tcPr>
-            <w:tcW w:type="dxa" w:w="3249"/>
+            <w:tcW w:type="dxa" w:w="1800"/>
+            <w:vAlign w:val="center"/>
+            <w:tcBorders>
+              <w:top w:val="single" w:sz="4" w:color="D9D9D9"/>
+              <w:left w:val="single" w:sz="4" w:color="D9D9D9"/>
+              <w:bottom w:val="single" w:sz="4" w:color="D9D9D9"/>
+              <w:right w:val="single" w:sz="4" w:color="D9D9D9"/>
+            </w:tcBorders>
+            <w:shd w:fill="FFFFFF"/>
+            <w:tcMar>
+              <w:top w:w="75" w:type="dxa"/>
+              <w:left w:w="75" w:type="dxa"/>
+              <w:bottom w:w="75" w:type="dxa"/>
+              <w:right w:w="75" w:type="dxa"/>
+            </w:tcMar>
           </w:tcPr>
           <w:p>
-            <w:r/>
+            <w:pPr>
+              <w:spacing w:after="20" w:line="252" w:lineRule="auto"/>
+            </w:pPr>
             <w:r>
               <w:rPr>
-                <w:rFonts w:ascii="맑은 고딕" w:hAnsi="맑은 고딕" w:eastAsia="맑은 고딕"/>
                 <w:b w:val="0"/>
-                <w:sz w:val="19"/>
+                <w:sz w:val="18"/>
               </w:rPr>
-              <w:t>내용 중복 지적</w:t>
+              <w:t>내용 구성 개선</w:t>
             </w:r>
           </w:p>
         </w:tc>
         <w:tc>
           <w:tcPr>
-            <w:tcW w:type="dxa" w:w="3249"/>
+            <w:tcW w:type="dxa" w:w="720"/>
+            <w:vAlign w:val="center"/>
+            <w:tcBorders>
+              <w:top w:val="single" w:sz="4" w:color="D9D9D9"/>
+              <w:left w:val="single" w:sz="4" w:color="D9D9D9"/>
+              <w:bottom w:val="single" w:sz="4" w:color="D9D9D9"/>
+              <w:right w:val="single" w:sz="4" w:color="D9D9D9"/>
+            </w:tcBorders>
+            <w:shd w:fill="FFFFFF"/>
+            <w:tcMar>
+              <w:top w:w="75" w:type="dxa"/>
+              <w:left w:w="75" w:type="dxa"/>
+              <w:bottom w:w="75" w:type="dxa"/>
+              <w:right w:w="75" w:type="dxa"/>
+            </w:tcMar>
           </w:tcPr>
           <w:p>
-            <w:r/>
+            <w:pPr>
+              <w:spacing w:after="20" w:line="252" w:lineRule="auto"/>
+              <w:jc w:val="center"/>
+            </w:pPr>
             <w:r>
               <w:rPr>
-                <w:rFonts w:ascii="맑은 고딕" w:hAnsi="맑은 고딕" w:eastAsia="맑은 고딕"/>
                 <w:b w:val="0"/>
-                <w:sz w:val="19"/>
+                <w:sz w:val="18"/>
               </w:rPr>
-              <w:t>5건</w:t>
+              <w:t>5</w:t>
             </w:r>
           </w:p>
         </w:tc>
         <w:tc>
           <w:tcPr>
-            <w:tcW w:type="dxa" w:w="3249"/>
+            <w:tcW w:type="dxa" w:w="7704"/>
+            <w:vAlign w:val="center"/>
+            <w:tcBorders>
+              <w:top w:val="single" w:sz="4" w:color="D9D9D9"/>
+              <w:left w:val="single" w:sz="4" w:color="D9D9D9"/>
+              <w:bottom w:val="single" w:sz="4" w:color="D9D9D9"/>
+              <w:right w:val="single" w:sz="4" w:color="D9D9D9"/>
+            </w:tcBorders>
+            <w:shd w:fill="FFFFFF"/>
+            <w:tcMar>
+              <w:top w:w="75" w:type="dxa"/>
+              <w:left w:w="75" w:type="dxa"/>
+              <w:bottom w:w="75" w:type="dxa"/>
+              <w:right w:w="75" w:type="dxa"/>
+            </w:tcMar>
           </w:tcPr>
           <w:p>
-            <w:r/>
+            <w:pPr>
+              <w:spacing w:after="20" w:line="252" w:lineRule="auto"/>
+            </w:pPr>
             <w:r>
               <w:rPr>
-                <w:rFonts w:ascii="맑은 고딕" w:hAnsi="맑은 고딕" w:eastAsia="맑은 고딕"/>
                 <w:b w:val="0"/>
-                <w:sz w:val="19"/>
+                <w:sz w:val="18"/>
               </w:rPr>
-              <w:t>문서 과정 — 기존 교육과 차별성 부족</w:t>
+              <w:t>“직무 사례를 직접 수정하는 시간보다 이론 설명이 많았습니다.”</w:t>
             </w:r>
           </w:p>
         </w:tc>
       </w:tr>
     </w:tbl>
-    <w:p/>
     <w:p>
       <w:pPr>
-        <w:spacing w:before="200"/>
+        <w:pStyle w:val="Heading1"/>
       </w:pPr>
       <w:r>
-        <w:rPr>
-          <w:rFonts w:ascii="맑은 고딕" w:hAnsi="맑은 고딕" w:eastAsia="맑은 고딕"/>
-          <w:b/>
-          <w:color w:val="153C78"/>
-          <w:sz w:val="24"/>
-        </w:rPr>
         <w:t>4. 진단</w:t>
       </w:r>
     </w:p>
     <w:p>
-      <w:pPr>
-        <w:ind w:left="283"/>
-      </w:pPr>
       <w:r>
-        <w:rPr>
-          <w:rFonts w:ascii="맑은 고딕" w:hAnsi="맑은 고딕" w:eastAsia="맑은 고딕"/>
-          <w:b w:val="0"/>
-        </w:rPr>
-        <w:t xml:space="preserve">• 참여자가 원하는 것은 분명하다 — </w:t>
+        <w:t>실무 적용성 4.3점과 실습 시간 확대 의견 11건은 직무에 직접 적용해 보는 교육의 필요성을 보여줍니다. 11건 중 8건은 AI 업무 기본, 2건은 데이터 분석 과정입니다.</w:t>
       </w:r>
+    </w:p>
+    <w:p>
       <w:r>
-        <w:rPr>
-          <w:rFonts w:ascii="맑은 고딕" w:hAnsi="맑은 고딕" w:eastAsia="맑은 고딕"/>
-          <w:b/>
-        </w:rPr>
-        <w:t>"실무에 바로 쓰는 기술을, 직접 해보며"</w:t>
+        <w:t>교육 환경 평균은 3.1점이며 관련 의견은 8건입니다. 장비·화면·로그인 준비뿐 아니라 좌석과 실내 환경도 점검할 필요가 있습니다.</w:t>
       </w:r>
+    </w:p>
+    <w:p>
       <w:r>
-        <w:rPr>
-          <w:rFonts w:ascii="맑은 고딕" w:hAnsi="맑은 고딕" w:eastAsia="맑은 고딕"/>
-          <w:b w:val="0"/>
-        </w:rPr>
-        <w:t>. 실무 적용성 점수(4.3)와 실습 시간 부족 의견(최다 11건)은 같은 신호다.</w:t>
+        <w:t>내용 구성 개선 의견 5건은 모두 사내 보고서 과정입니다. 교육콘텐츠 검수는 전반 만족도 3.0점(6명)이지만 내용 구성은 4.0점이므로 낮은 만족도의 원인을 단정할 수 없습니다.</w:t>
+      </w:r>
+    </w:p>
+    <w:p>
+      <w:r>
+        <w:t>심화 요청 6건은 AI 업무 기본 4건, 데이터 분석 2건입니다. 신청 자료에서 AI 업무 기본은 49명/정원 30명(163.3%)이지만 두 자료는 별도 표본이므로 동일 집단의 변화로 해석하지 않습니다.</w:t>
       </w:r>
     </w:p>
     <w:p>
       <w:pPr>
-        <w:ind w:left="283"/>
+        <w:pStyle w:val="Heading1"/>
       </w:pPr>
       <w:r>
-        <w:rPr>
-          <w:rFonts w:ascii="맑은 고딕" w:hAnsi="맑은 고딕" w:eastAsia="맑은 고딕"/>
-          <w:b w:val="0"/>
-        </w:rPr>
-        <w:t xml:space="preserve">• 만족도를 깎는 요인은 내용이 아니라 </w:t>
-      </w:r>
-      <w:r>
-        <w:rPr>
-          <w:rFonts w:ascii="맑은 고딕" w:hAnsi="맑은 고딕" w:eastAsia="맑은 고딕"/>
-          <w:b/>
-        </w:rPr>
-        <w:t>환경(3.1)과 편성</w:t>
-      </w:r>
-      <w:r>
-        <w:rPr>
-          <w:rFonts w:ascii="맑은 고딕" w:hAnsi="맑은 고딕" w:eastAsia="맑은 고딕"/>
-          <w:b w:val="0"/>
-        </w:rPr>
-        <w:t>이다.</w:t>
-      </w:r>
-    </w:p>
-    <w:p>
-      <w:pPr>
-        <w:ind w:left="283"/>
-      </w:pPr>
-      <w:r>
-        <w:rPr>
-          <w:rFonts w:ascii="맑은 고딕" w:hAnsi="맑은 고딕" w:eastAsia="맑은 고딕"/>
-          <w:b w:val="0"/>
-        </w:rPr>
-        <w:t xml:space="preserve">• AI 과정은 수요(신청 초과)·만족(4.5)·후속 요구(6건)가 모두 확인된 </w:t>
-      </w:r>
-      <w:r>
-        <w:rPr>
-          <w:rFonts w:ascii="맑은 고딕" w:hAnsi="맑은 고딕" w:eastAsia="맑은 고딕"/>
-          <w:b/>
-        </w:rPr>
-        <w:t>전략 과정</w:t>
-      </w:r>
-      <w:r>
-        <w:rPr>
-          <w:rFonts w:ascii="맑은 고딕" w:hAnsi="맑은 고딕" w:eastAsia="맑은 고딕"/>
-          <w:b w:val="0"/>
-        </w:rPr>
-        <w:t>이다.</w:t>
-      </w:r>
-    </w:p>
-    <w:p>
-      <w:pPr>
-        <w:spacing w:before="200"/>
-      </w:pPr>
-      <w:r>
-        <w:rPr>
-          <w:rFonts w:ascii="맑은 고딕" w:hAnsi="맑은 고딕" w:eastAsia="맑은 고딕"/>
-          <w:b/>
-          <w:color w:val="153C78"/>
-          <w:sz w:val="24"/>
-        </w:rPr>
-        <w:t>5. 개선 3대 과제 (차기 연수 계획 반영)</w:t>
-      </w:r>
-    </w:p>
-    <w:p>
-      <w:pPr>
-        <w:ind w:left="283"/>
-      </w:pPr>
-      <w:r>
-        <w:rPr>
-          <w:rFonts w:ascii="맑은 고딕" w:hAnsi="맑은 고딕" w:eastAsia="맑은 고딕"/>
-          <w:b w:val="0"/>
-        </w:rPr>
-        <w:t xml:space="preserve">1. </w:t>
-      </w:r>
-      <w:r>
-        <w:rPr>
-          <w:rFonts w:ascii="맑은 고딕" w:hAnsi="맑은 고딕" w:eastAsia="맑은 고딕"/>
-          <w:b/>
-        </w:rPr>
-        <w:t>실습 중심 확대</w:t>
-      </w:r>
-      <w:r>
-        <w:rPr>
-          <w:rFonts w:ascii="맑은 고딕" w:hAnsi="맑은 고딕" w:eastAsia="맑은 고딕"/>
-          <w:b w:val="0"/>
-        </w:rPr>
-        <w:t xml:space="preserve"> — 인기 과정의 실습 시간 증배, 이론·시연 비중 축소</w:t>
-      </w:r>
-    </w:p>
-    <w:p>
-      <w:pPr>
-        <w:ind w:left="283"/>
-      </w:pPr>
-      <w:r>
-        <w:rPr>
-          <w:rFonts w:ascii="맑은 고딕" w:hAnsi="맑은 고딕" w:eastAsia="맑은 고딕"/>
-          <w:b w:val="0"/>
-        </w:rPr>
-        <w:t xml:space="preserve">2. </w:t>
-      </w:r>
-      <w:r>
-        <w:rPr>
-          <w:rFonts w:ascii="맑은 고딕" w:hAnsi="맑은 고딕" w:eastAsia="맑은 고딕"/>
-          <w:b/>
-        </w:rPr>
-        <w:t>교육 환경 개선</w:t>
-      </w:r>
-      <w:r>
-        <w:rPr>
-          <w:rFonts w:ascii="맑은 고딕" w:hAnsi="맑은 고딕" w:eastAsia="맑은 고딕"/>
-          <w:b w:val="0"/>
-        </w:rPr>
-        <w:t xml:space="preserve"> — 교육장 장비·네트워크 정비, 분반 운영으로 밀도 완화</w:t>
-      </w:r>
-    </w:p>
-    <w:p>
-      <w:pPr>
-        <w:ind w:left="283"/>
-      </w:pPr>
-      <w:r>
-        <w:rPr>
-          <w:rFonts w:ascii="맑은 고딕" w:hAnsi="맑은 고딕" w:eastAsia="맑은 고딕"/>
-          <w:b w:val="0"/>
-        </w:rPr>
-        <w:t xml:space="preserve">3. </w:t>
-      </w:r>
-      <w:r>
-        <w:rPr>
-          <w:rFonts w:ascii="맑은 고딕" w:hAnsi="맑은 고딕" w:eastAsia="맑은 고딕"/>
-          <w:b/>
-        </w:rPr>
-        <w:t>AI 심화 과정 신설</w:t>
-      </w:r>
-      <w:r>
-        <w:rPr>
-          <w:rFonts w:ascii="맑은 고딕" w:hAnsi="맑은 고딕" w:eastAsia="맑은 고딕"/>
-          <w:b w:val="0"/>
-        </w:rPr>
-        <w:t xml:space="preserve"> — 기존 수료자 대상 후속 과정 개설, 시리즈화</w:t>
+        <w:t>5. 개선 3대 과제</w:t>
       </w:r>
     </w:p>
     <w:p>
       <w:r>
-        <w:rPr>
-          <w:rFonts w:ascii="맑은 고딕" w:hAnsi="맑은 고딕" w:eastAsia="맑은 고딕"/>
-          <w:b w:val="0"/>
-          <w:color w:val="5A6675"/>
-          <w:sz w:val="16"/>
-        </w:rPr>
-        <w:t>────────────────────────────────────────</w:t>
+        <w:t>차기 교육 계획을 위한 실습용 제안</w:t>
       </w:r>
     </w:p>
     <w:p>
       <w:r>
-        <w:rPr>
-          <w:rFonts w:ascii="맑은 고딕" w:hAnsi="맑은 고딕" w:eastAsia="맑은 고딕"/>
-          <w:b w:val="0"/>
-          <w:color w:val="5A6675"/>
-          <w:sz w:val="18"/>
-        </w:rPr>
-        <w:t>본 자료는 교육 실습용으로 가공한 예시 데이터의 분석 결과입니다.</w:t>
+        <w:t>1. 직무 실습 확대: 검수 의견 정리, 사내 보고서 수정, 교사·학부모 문의 답변 등 부문별 과제를 직접 완성할 시간을 늘립니다.</w:t>
+      </w:r>
+    </w:p>
+    <w:p>
+      <w:r>
+        <w:t>2. 교육 환경·구성 개선: 실습 전 장비와 로그인 상태를 확인하고, 사내 보고서 과정의 이론 비중·기존 교육 중복을 조정합니다. 콘텐츠 검수 과정은 추가 의견을 확인합니다.</w:t>
+      </w:r>
+    </w:p>
+    <w:p>
+      <w:r>
+        <w:t>3. 후속 과정 제안: AI 업무 기본과 데이터 분석의 심화 수요를 추가 조사하고, 공통 기본 과정 이후 직무별 후속 실습을 검토합니다.</w:t>
+      </w:r>
+    </w:p>
+    <w:p>
+      <w:r>
+        <w:t>수치 출처: 실습2_만족도_설문응답.xlsx의 응답원본 2~73행. 신청 수치는 실습1_연수_신청자명단.xlsx의 신청자명단 2~151행·프로그램표 2~7행. 자유 의견 38건은 응답당 하나의 대표 유형으로 분류한 예시입니다.</w:t>
       </w:r>
     </w:p>
     <w:sectPr>
       <w:pgSz w:w="12240" w:h="15840"/>
-      <w:pgMar w:top="1134" w:right="1247" w:bottom="1134" w:left="1247" w:header="720" w:footer="720" w:gutter="0"/>
+      <w:pgMar w:top="936" w:right="1008" w:bottom="936" w:left="1008" w:header="720" w:footer="720" w:gutter="0"/>
       <w:cols w:space="720"/>
       <w:docGrid w:linePitch="360"/>
     </w:sectPr>
@@ -1159,9 +1794,13 @@
     <w:name w:val="Normal"/>
     <w:qFormat/>
     <w:rsid w:val="00FC693F"/>
+    <w:pPr>
+      <w:spacing w:after="100" w:line="269" w:lineRule="auto"/>
+    </w:pPr>
     <w:rPr>
       <w:rFonts w:ascii="맑은 고딕" w:hAnsi="맑은 고딕" w:eastAsia="맑은 고딕"/>
-      <w:sz w:val="21"/>
+      <w:color w:val="000000"/>
+      <w:sz w:val="19"/>
     </w:rPr>
   </w:style>
   <w:style w:type="paragraph" w:styleId="Header">
@@ -1219,15 +1858,15 @@
     <w:pPr>
       <w:keepNext/>
       <w:keepLines/>
-      <w:spacing w:before="480" w:after="0"/>
+      <w:spacing w:before="200" w:after="100"/>
       <w:outlineLvl w:val="0"/>
     </w:pPr>
     <w:rPr>
-      <w:rFonts w:asciiTheme="majorHAnsi" w:eastAsiaTheme="majorEastAsia" w:hAnsiTheme="majorHAnsi" w:cstheme="majorBidi"/>
+      <w:rFonts w:asciiTheme="majorHAnsi" w:eastAsiaTheme="majorEastAsia" w:hAnsiTheme="majorHAnsi" w:cstheme="majorBidi" w:ascii="맑은 고딕" w:hAnsi="맑은 고딕" w:eastAsia="맑은 고딕"/>
       <w:b/>
       <w:bCs/>
-      <w:color w:val="365F91" w:themeColor="accent1" w:themeShade="BF"/>
-      <w:sz w:val="28"/>
+      <w:color w:val="000000"/>
+      <w:sz w:val="24"/>
       <w:szCs w:val="28"/>
     </w:rPr>
   </w:style>
@@ -1247,10 +1886,10 @@
       <w:outlineLvl w:val="1"/>
     </w:pPr>
     <w:rPr>
-      <w:rFonts w:asciiTheme="majorHAnsi" w:eastAsiaTheme="majorEastAsia" w:hAnsiTheme="majorHAnsi" w:cstheme="majorBidi"/>
+      <w:rFonts w:asciiTheme="majorHAnsi" w:eastAsiaTheme="majorEastAsia" w:hAnsiTheme="majorHAnsi" w:cstheme="majorBidi" w:ascii="맑은 고딕" w:hAnsi="맑은 고딕" w:eastAsia="맑은 고딕"/>
       <w:b/>
       <w:bCs/>
-      <w:color w:val="4F81BD" w:themeColor="accent1"/>
+      <w:color w:val="000000"/>
       <w:sz w:val="26"/>
       <w:szCs w:val="26"/>
     </w:rPr>
@@ -1512,11 +2151,11 @@
       <w:contextualSpacing/>
     </w:pPr>
     <w:rPr>
-      <w:rFonts w:asciiTheme="majorHAnsi" w:eastAsiaTheme="majorEastAsia" w:hAnsiTheme="majorHAnsi" w:cstheme="majorBidi"/>
-      <w:color w:val="17365D" w:themeColor="text2" w:themeShade="BF"/>
+      <w:rFonts w:asciiTheme="majorHAnsi" w:eastAsiaTheme="majorEastAsia" w:hAnsiTheme="majorHAnsi" w:cstheme="majorBidi" w:ascii="맑은 고딕" w:hAnsi="맑은 고딕" w:eastAsia="맑은 고딕"/>
+      <w:color w:val="000000"/>
       <w:spacing w:val="5"/>
       <w:kern w:val="28"/>
-      <w:sz w:val="52"/>
+      <w:sz w:val="40"/>
       <w:szCs w:val="52"/>
     </w:rPr>
   </w:style>
@@ -1549,12 +2188,12 @@
       </w:numPr>
     </w:pPr>
     <w:rPr>
-      <w:rFonts w:asciiTheme="majorHAnsi" w:eastAsiaTheme="majorEastAsia" w:hAnsiTheme="majorHAnsi" w:cstheme="majorBidi"/>
+      <w:rFonts w:asciiTheme="majorHAnsi" w:eastAsiaTheme="majorEastAsia" w:hAnsiTheme="majorHAnsi" w:cstheme="majorBidi" w:ascii="맑은 고딕" w:hAnsi="맑은 고딕" w:eastAsia="맑은 고딕"/>
       <w:i/>
       <w:iCs/>
-      <w:color w:val="4F81BD" w:themeColor="accent1"/>
+      <w:color w:val="000000"/>
       <w:spacing w:val="15"/>
-      <w:sz w:val="24"/>
+      <w:sz w:val="26"/>
       <w:szCs w:val="24"/>
     </w:rPr>
   </w:style>

</xml_diff>

<commit_message>
fix: restore base course and separate MiraeN customization
</commit_message>
<xml_diff>
--- a/업무자동화_자료/실습5_만족도_분석요약.docx
+++ b/업무자동화_자료/실습5_만족도_분석요약.docx
@@ -3,813 +3,291 @@
 <w:document xmlns:wpc="http://schemas.microsoft.com/office/word/2010/wordprocessingCanvas" xmlns:mo="http://schemas.microsoft.com/office/mac/office/2008/main" xmlns:mc="http://schemas.openxmlformats.org/markup-compatibility/2006" xmlns:mv="urn:schemas-microsoft-com:mac:vml" xmlns:o="urn:schemas-microsoft-com:office:office" xmlns:r="http://schemas.openxmlformats.org/officeDocument/2006/relationships" xmlns:m="http://schemas.openxmlformats.org/officeDocument/2006/math" xmlns:v="urn:schemas-microsoft-com:vml" xmlns:wp14="http://schemas.microsoft.com/office/word/2010/wordprocessingDrawing" xmlns:wp="http://schemas.openxmlformats.org/drawingml/2006/wordprocessingDrawing" xmlns:w10="urn:schemas-microsoft-com:office:word" xmlns:w="http://schemas.openxmlformats.org/wordprocessingml/2006/main" xmlns:w14="http://schemas.microsoft.com/office/word/2010/wordml" xmlns:wpg="http://schemas.microsoft.com/office/word/2010/wordprocessingGroup" xmlns:wpi="http://schemas.microsoft.com/office/word/2010/wordprocessingInk" xmlns:wne="http://schemas.microsoft.com/office/word/2006/wordml" xmlns:wps="http://schemas.microsoft.com/office/word/2010/wordprocessingShape" mc:Ignorable="w14 wp14">
   <w:body>
     <w:p>
-      <w:pPr>
-        <w:pStyle w:val="Title"/>
-      </w:pPr>
       <w:r>
-        <w:t>미래엔 전사 AI 업무역량 교육</w:t>
+        <w:rPr>
+          <w:rFonts w:ascii="맑은 고딕" w:hAnsi="맑은 고딕" w:eastAsia="맑은 고딕"/>
+          <w:b/>
+          <w:color w:val="153C78"/>
+          <w:sz w:val="30"/>
+        </w:rPr>
+        <w:t>2026 하반기 직원 역량개발 연수 — 만족도 조사 분석 요약</w:t>
       </w:r>
     </w:p>
     <w:p>
       <w:pPr>
-        <w:pStyle w:val="Subtitle"/>
+        <w:ind w:left="340"/>
       </w:pPr>
       <w:r>
-        <w:t>만족도 조사 분석 요약</w:t>
+        <w:rPr>
+          <w:rFonts w:ascii="맑은 고딕" w:hAnsi="맑은 고딕" w:eastAsia="맑은 고딕"/>
+          <w:b/>
+          <w:color w:val="5A6675"/>
+          <w:sz w:val="19"/>
+        </w:rPr>
+        <w:t>문서 성격</w:t>
+      </w:r>
+      <w:r>
+        <w:rPr>
+          <w:rFonts w:ascii="맑은 고딕" w:hAnsi="맑은 고딕" w:eastAsia="맑은 고딕"/>
+          <w:b w:val="0"/>
+          <w:color w:val="5A6675"/>
+          <w:sz w:val="19"/>
+        </w:rPr>
+        <w:t>: 만족도 설문(72명 응답) 분석 결과 요약 · 보고 장표 제작 실습용 재료</w:t>
+      </w:r>
+    </w:p>
+    <w:p>
+      <w:pPr>
+        <w:ind w:left="340"/>
+      </w:pPr>
+      <w:r>
+        <w:rPr>
+          <w:rFonts w:ascii="맑은 고딕" w:hAnsi="맑은 고딕" w:eastAsia="맑은 고딕"/>
+          <w:b/>
+          <w:color w:val="5A6675"/>
+          <w:sz w:val="19"/>
+        </w:rPr>
+        <w:t>활용 방법</w:t>
+      </w:r>
+      <w:r>
+        <w:rPr>
+          <w:rFonts w:ascii="맑은 고딕" w:hAnsi="맑은 고딕" w:eastAsia="맑은 고딕"/>
+          <w:b w:val="0"/>
+          <w:color w:val="5A6675"/>
+          <w:sz w:val="19"/>
+        </w:rPr>
+        <w:t>: 이 내용을 시각화 도구(Napkin·NotebookLM·Claude)에 붙여넣거나 업로드해 보고용 장표를 만듭니다.</w:t>
       </w:r>
     </w:p>
     <w:p>
       <w:r>
-        <w:t>실습용 가상 자료입니다. 실제 미래엔 조직·인사정책·교육제도·성과를 나타내지 않습니다.</w:t>
-      </w:r>
-    </w:p>
-    <w:p>
-      <w:r>
-        <w:t>활용 방법: 이 요약을 Napkin·NotebookLM·Claude에 입력해 보고용 장표를 만듭니다.</w:t>
+        <w:rPr>
+          <w:rFonts w:ascii="맑은 고딕" w:hAnsi="맑은 고딕" w:eastAsia="맑은 고딕"/>
+          <w:b w:val="0"/>
+          <w:color w:val="5A6675"/>
+          <w:sz w:val="16"/>
+        </w:rPr>
+        <w:t>────────────────────────────────────────</w:t>
       </w:r>
     </w:p>
     <w:p>
       <w:pPr>
-        <w:pStyle w:val="Heading1"/>
+        <w:spacing w:before="200"/>
       </w:pPr>
       <w:r>
+        <w:rPr>
+          <w:rFonts w:ascii="맑은 고딕" w:hAnsi="맑은 고딕" w:eastAsia="맑은 고딕"/>
+          <w:b/>
+          <w:color w:val="153C78"/>
+          <w:sz w:val="24"/>
+        </w:rPr>
         <w:t>1. 조사 개요</w:t>
       </w:r>
     </w:p>
     <w:p>
+      <w:pPr>
+        <w:ind w:left="283"/>
+      </w:pPr>
       <w:r>
-        <w:t>대상: AI 업무 기본·데이터 분석·사내 보고서·교육콘텐츠 검수·제작운영·고객응대 6개 과정의 가상 참여자</w:t>
-      </w:r>
-    </w:p>
-    <w:p>
-      <w:r>
-        <w:t>응답: 72명. 2026년 8월 22일 온라인 제출을 상정한 별도 만족도 표본이며, 실습 1의 신청자와 동일인을 연결하지 않습니다.</w:t>
-      </w:r>
-    </w:p>
-    <w:p>
-      <w:r>
-        <w:t>문항: 5점 척도 5문항 + 재참여 의향 + 자유 의견. 평균은 소수 둘째 자리에서 반올림합니다.</w:t>
+        <w:rPr>
+          <w:rFonts w:ascii="맑은 고딕" w:hAnsi="맑은 고딕" w:eastAsia="맑은 고딕"/>
+          <w:b w:val="0"/>
+        </w:rPr>
+        <w:t>• 대상: 2026 하반기 직원 역량개발 연수 6개 과정 참여자</w:t>
       </w:r>
     </w:p>
     <w:p>
       <w:pPr>
-        <w:pStyle w:val="Heading1"/>
+        <w:ind w:left="283"/>
       </w:pPr>
       <w:r>
+        <w:rPr>
+          <w:rFonts w:ascii="맑은 고딕" w:hAnsi="맑은 고딕" w:eastAsia="맑은 고딕"/>
+          <w:b w:val="0"/>
+        </w:rPr>
+        <w:t>• 응답: 72명 (설문 기간 중 온라인 제출)</w:t>
+      </w:r>
+    </w:p>
+    <w:p>
+      <w:pPr>
+        <w:ind w:left="283"/>
+      </w:pPr>
+      <w:r>
+        <w:rPr>
+          <w:rFonts w:ascii="맑은 고딕" w:hAnsi="맑은 고딕" w:eastAsia="맑은 고딕"/>
+          <w:b w:val="0"/>
+        </w:rPr>
+        <w:t>• 문항: 5점 척도 5문항(전반 만족도·내용 구성·실무 적용 가능성·교육 환경·추천 의향) + 재참여 의향 + 자유 의견</w:t>
+      </w:r>
+    </w:p>
+    <w:p>
+      <w:pPr>
+        <w:spacing w:before="200"/>
+      </w:pPr>
+      <w:r>
+        <w:rPr>
+          <w:rFonts w:ascii="맑은 고딕" w:hAnsi="맑은 고딕" w:eastAsia="맑은 고딕"/>
+          <w:b/>
+          <w:color w:val="153C78"/>
+          <w:sz w:val="24"/>
+        </w:rPr>
         <w:t>2. 핵심 수치</w:t>
       </w:r>
     </w:p>
     <w:p>
+      <w:pPr>
+        <w:ind w:left="283"/>
+      </w:pPr>
       <w:r>
-        <w:t>문항 평균: 전반 만족도 4.0점, 내용 구성 4.0점, 실무 적용 가능성 4.3점, 교육 환경 3.1점, 추천 의향 4.0점.</w:t>
+        <w:rPr>
+          <w:rFonts w:ascii="맑은 고딕" w:hAnsi="맑은 고딕" w:eastAsia="맑은 고딕"/>
+          <w:b w:val="0"/>
+        </w:rPr>
+        <w:t xml:space="preserve">• 전반 만족도 평균 </w:t>
       </w:r>
-    </w:p>
-    <w:p>
       <w:r>
-        <w:t>실무 적용 가능성이 가장 높고 교육 환경이 가장 낮습니다. 재참여 의향은 58명(80.6%)이 “예”로 응답했습니다.</w:t>
+        <w:rPr>
+          <w:rFonts w:ascii="맑은 고딕" w:hAnsi="맑은 고딕" w:eastAsia="맑은 고딕"/>
+          <w:b/>
+        </w:rPr>
+        <w:t>4.0점</w:t>
       </w:r>
-    </w:p>
-    <w:tbl>
-      <w:tblPr>
-        <w:tblW w:type="auto" w:w="0"/>
-        <w:tblLayout w:type="fixed"/>
-        <w:tblLook w:firstColumn="1" w:firstRow="1" w:lastColumn="0" w:lastRow="0" w:noHBand="0" w:noVBand="1" w:val="04A0"/>
-      </w:tblPr>
-      <w:tblGrid>
-        <w:gridCol w:w="3408"/>
-        <w:gridCol w:w="3408"/>
-        <w:gridCol w:w="3408"/>
-      </w:tblGrid>
-      <w:tr>
-        <w:trPr>
-          <w:tblHeader/>
-        </w:trPr>
-        <w:tc>
-          <w:tcPr>
-            <w:tcW w:type="dxa" w:w="5616"/>
-            <w:vAlign w:val="center"/>
-            <w:tcBorders>
-              <w:top w:val="single" w:sz="4" w:color="D9D9D9"/>
-              <w:left w:val="single" w:sz="4" w:color="D9D9D9"/>
-              <w:bottom w:val="single" w:sz="4" w:color="D9D9D9"/>
-              <w:right w:val="single" w:sz="4" w:color="D9D9D9"/>
-            </w:tcBorders>
-            <w:shd w:fill="DCE6F1"/>
-            <w:tcMar>
-              <w:top w:w="75" w:type="dxa"/>
-              <w:left w:w="75" w:type="dxa"/>
-              <w:bottom w:w="75" w:type="dxa"/>
-              <w:right w:w="75" w:type="dxa"/>
-            </w:tcMar>
-          </w:tcPr>
-          <w:p>
-            <w:pPr>
-              <w:spacing w:after="20" w:line="252" w:lineRule="auto"/>
-            </w:pPr>
-            <w:r>
-              <w:rPr>
-                <w:b/>
-                <w:sz w:val="18"/>
-              </w:rPr>
-              <w:t>과정</w:t>
-            </w:r>
-          </w:p>
-        </w:tc>
-        <w:tc>
-          <w:tcPr>
-            <w:tcW w:type="dxa" w:w="1872"/>
-            <w:vAlign w:val="center"/>
-            <w:tcBorders>
-              <w:top w:val="single" w:sz="4" w:color="D9D9D9"/>
-              <w:left w:val="single" w:sz="4" w:color="D9D9D9"/>
-              <w:bottom w:val="single" w:sz="4" w:color="D9D9D9"/>
-              <w:right w:val="single" w:sz="4" w:color="D9D9D9"/>
-            </w:tcBorders>
-            <w:shd w:fill="DCE6F1"/>
-            <w:tcMar>
-              <w:top w:w="75" w:type="dxa"/>
-              <w:left w:w="75" w:type="dxa"/>
-              <w:bottom w:w="75" w:type="dxa"/>
-              <w:right w:w="75" w:type="dxa"/>
-            </w:tcMar>
-          </w:tcPr>
-          <w:p>
-            <w:pPr>
-              <w:spacing w:after="20" w:line="252" w:lineRule="auto"/>
-              <w:jc w:val="center"/>
-            </w:pPr>
-            <w:r>
-              <w:rPr>
-                <w:b/>
-                <w:sz w:val="18"/>
-              </w:rPr>
-              <w:t>응답 수(명)</w:t>
-            </w:r>
-          </w:p>
-        </w:tc>
-        <w:tc>
-          <w:tcPr>
-            <w:tcW w:type="dxa" w:w="2736"/>
-            <w:vAlign w:val="center"/>
-            <w:tcBorders>
-              <w:top w:val="single" w:sz="4" w:color="D9D9D9"/>
-              <w:left w:val="single" w:sz="4" w:color="D9D9D9"/>
-              <w:bottom w:val="single" w:sz="4" w:color="D9D9D9"/>
-              <w:right w:val="single" w:sz="4" w:color="D9D9D9"/>
-            </w:tcBorders>
-            <w:shd w:fill="DCE6F1"/>
-            <w:tcMar>
-              <w:top w:w="75" w:type="dxa"/>
-              <w:left w:w="75" w:type="dxa"/>
-              <w:bottom w:w="75" w:type="dxa"/>
-              <w:right w:w="75" w:type="dxa"/>
-            </w:tcMar>
-          </w:tcPr>
-          <w:p>
-            <w:pPr>
-              <w:spacing w:after="20" w:line="252" w:lineRule="auto"/>
-            </w:pPr>
-            <w:r>
-              <w:rPr>
-                <w:b/>
-                <w:sz w:val="18"/>
-              </w:rPr>
-              <w:t>전반 만족도(5점)</w:t>
-            </w:r>
-          </w:p>
-        </w:tc>
-      </w:tr>
-      <w:tr>
-        <w:tc>
-          <w:tcPr>
-            <w:tcW w:type="dxa" w:w="5616"/>
-            <w:vAlign w:val="center"/>
-            <w:tcBorders>
-              <w:top w:val="single" w:sz="4" w:color="D9D9D9"/>
-              <w:left w:val="single" w:sz="4" w:color="D9D9D9"/>
-              <w:bottom w:val="single" w:sz="4" w:color="D9D9D9"/>
-              <w:right w:val="single" w:sz="4" w:color="D9D9D9"/>
-            </w:tcBorders>
-            <w:shd w:fill="FFFFFF"/>
-            <w:tcMar>
-              <w:top w:w="75" w:type="dxa"/>
-              <w:left w:w="75" w:type="dxa"/>
-              <w:bottom w:w="75" w:type="dxa"/>
-              <w:right w:w="75" w:type="dxa"/>
-            </w:tcMar>
-          </w:tcPr>
-          <w:p>
-            <w:pPr>
-              <w:spacing w:after="20" w:line="252" w:lineRule="auto"/>
-            </w:pPr>
-            <w:r>
-              <w:rPr>
-                <w:b w:val="0"/>
-                <w:sz w:val="18"/>
-              </w:rPr>
-              <w:t>AI 업무 기본</w:t>
-            </w:r>
-          </w:p>
-        </w:tc>
-        <w:tc>
-          <w:tcPr>
-            <w:tcW w:type="dxa" w:w="1872"/>
-            <w:vAlign w:val="center"/>
-            <w:tcBorders>
-              <w:top w:val="single" w:sz="4" w:color="D9D9D9"/>
-              <w:left w:val="single" w:sz="4" w:color="D9D9D9"/>
-              <w:bottom w:val="single" w:sz="4" w:color="D9D9D9"/>
-              <w:right w:val="single" w:sz="4" w:color="D9D9D9"/>
-            </w:tcBorders>
-            <w:shd w:fill="FFFFFF"/>
-            <w:tcMar>
-              <w:top w:w="75" w:type="dxa"/>
-              <w:left w:w="75" w:type="dxa"/>
-              <w:bottom w:w="75" w:type="dxa"/>
-              <w:right w:w="75" w:type="dxa"/>
-            </w:tcMar>
-          </w:tcPr>
-          <w:p>
-            <w:pPr>
-              <w:spacing w:after="20" w:line="252" w:lineRule="auto"/>
-              <w:jc w:val="center"/>
-            </w:pPr>
-            <w:r>
-              <w:rPr>
-                <w:b w:val="0"/>
-                <w:sz w:val="18"/>
-              </w:rPr>
-              <w:t>26</w:t>
-            </w:r>
-          </w:p>
-        </w:tc>
-        <w:tc>
-          <w:tcPr>
-            <w:tcW w:type="dxa" w:w="2736"/>
-            <w:vAlign w:val="center"/>
-            <w:tcBorders>
-              <w:top w:val="single" w:sz="4" w:color="D9D9D9"/>
-              <w:left w:val="single" w:sz="4" w:color="D9D9D9"/>
-              <w:bottom w:val="single" w:sz="4" w:color="D9D9D9"/>
-              <w:right w:val="single" w:sz="4" w:color="D9D9D9"/>
-            </w:tcBorders>
-            <w:shd w:fill="FFFFFF"/>
-            <w:tcMar>
-              <w:top w:w="75" w:type="dxa"/>
-              <w:left w:w="75" w:type="dxa"/>
-              <w:bottom w:w="75" w:type="dxa"/>
-              <w:right w:w="75" w:type="dxa"/>
-            </w:tcMar>
-          </w:tcPr>
-          <w:p>
-            <w:pPr>
-              <w:spacing w:after="20" w:line="252" w:lineRule="auto"/>
-            </w:pPr>
-            <w:r>
-              <w:rPr>
-                <w:b w:val="0"/>
-                <w:sz w:val="18"/>
-              </w:rPr>
-              <w:t>4.5</w:t>
-            </w:r>
-          </w:p>
-        </w:tc>
-      </w:tr>
-      <w:tr>
-        <w:tc>
-          <w:tcPr>
-            <w:tcW w:type="dxa" w:w="5616"/>
-            <w:vAlign w:val="center"/>
-            <w:tcBorders>
-              <w:top w:val="single" w:sz="4" w:color="D9D9D9"/>
-              <w:left w:val="single" w:sz="4" w:color="D9D9D9"/>
-              <w:bottom w:val="single" w:sz="4" w:color="D9D9D9"/>
-              <w:right w:val="single" w:sz="4" w:color="D9D9D9"/>
-            </w:tcBorders>
-            <w:shd w:fill="FFFFFF"/>
-            <w:tcMar>
-              <w:top w:w="75" w:type="dxa"/>
-              <w:left w:w="75" w:type="dxa"/>
-              <w:bottom w:w="75" w:type="dxa"/>
-              <w:right w:w="75" w:type="dxa"/>
-            </w:tcMar>
-          </w:tcPr>
-          <w:p>
-            <w:pPr>
-              <w:spacing w:after="20" w:line="252" w:lineRule="auto"/>
-            </w:pPr>
-            <w:r>
-              <w:rPr>
-                <w:b w:val="0"/>
-                <w:sz w:val="18"/>
-              </w:rPr>
-              <w:t>AI 데이터 분석 기초</w:t>
-            </w:r>
-          </w:p>
-        </w:tc>
-        <w:tc>
-          <w:tcPr>
-            <w:tcW w:type="dxa" w:w="1872"/>
-            <w:vAlign w:val="center"/>
-            <w:tcBorders>
-              <w:top w:val="single" w:sz="4" w:color="D9D9D9"/>
-              <w:left w:val="single" w:sz="4" w:color="D9D9D9"/>
-              <w:bottom w:val="single" w:sz="4" w:color="D9D9D9"/>
-              <w:right w:val="single" w:sz="4" w:color="D9D9D9"/>
-            </w:tcBorders>
-            <w:shd w:fill="FFFFFF"/>
-            <w:tcMar>
-              <w:top w:w="75" w:type="dxa"/>
-              <w:left w:w="75" w:type="dxa"/>
-              <w:bottom w:w="75" w:type="dxa"/>
-              <w:right w:w="75" w:type="dxa"/>
-            </w:tcMar>
-          </w:tcPr>
-          <w:p>
-            <w:pPr>
-              <w:spacing w:after="20" w:line="252" w:lineRule="auto"/>
-              <w:jc w:val="center"/>
-            </w:pPr>
-            <w:r>
-              <w:rPr>
-                <w:b w:val="0"/>
-                <w:sz w:val="18"/>
-              </w:rPr>
-              <w:t>14</w:t>
-            </w:r>
-          </w:p>
-        </w:tc>
-        <w:tc>
-          <w:tcPr>
-            <w:tcW w:type="dxa" w:w="2736"/>
-            <w:vAlign w:val="center"/>
-            <w:tcBorders>
-              <w:top w:val="single" w:sz="4" w:color="D9D9D9"/>
-              <w:left w:val="single" w:sz="4" w:color="D9D9D9"/>
-              <w:bottom w:val="single" w:sz="4" w:color="D9D9D9"/>
-              <w:right w:val="single" w:sz="4" w:color="D9D9D9"/>
-            </w:tcBorders>
-            <w:shd w:fill="FFFFFF"/>
-            <w:tcMar>
-              <w:top w:w="75" w:type="dxa"/>
-              <w:left w:w="75" w:type="dxa"/>
-              <w:bottom w:w="75" w:type="dxa"/>
-              <w:right w:w="75" w:type="dxa"/>
-            </w:tcMar>
-          </w:tcPr>
-          <w:p>
-            <w:pPr>
-              <w:spacing w:after="20" w:line="252" w:lineRule="auto"/>
-            </w:pPr>
-            <w:r>
-              <w:rPr>
-                <w:b w:val="0"/>
-                <w:sz w:val="18"/>
-              </w:rPr>
-              <w:t>3.9</w:t>
-            </w:r>
-          </w:p>
-        </w:tc>
-      </w:tr>
-      <w:tr>
-        <w:tc>
-          <w:tcPr>
-            <w:tcW w:type="dxa" w:w="5616"/>
-            <w:vAlign w:val="center"/>
-            <w:tcBorders>
-              <w:top w:val="single" w:sz="4" w:color="D9D9D9"/>
-              <w:left w:val="single" w:sz="4" w:color="D9D9D9"/>
-              <w:bottom w:val="single" w:sz="4" w:color="D9D9D9"/>
-              <w:right w:val="single" w:sz="4" w:color="D9D9D9"/>
-            </w:tcBorders>
-            <w:shd w:fill="FFFFFF"/>
-            <w:tcMar>
-              <w:top w:w="75" w:type="dxa"/>
-              <w:left w:w="75" w:type="dxa"/>
-              <w:bottom w:w="75" w:type="dxa"/>
-              <w:right w:w="75" w:type="dxa"/>
-            </w:tcMar>
-          </w:tcPr>
-          <w:p>
-            <w:pPr>
-              <w:spacing w:after="20" w:line="252" w:lineRule="auto"/>
-            </w:pPr>
-            <w:r>
-              <w:rPr>
-                <w:b w:val="0"/>
-                <w:sz w:val="18"/>
-              </w:rPr>
-              <w:t>AI 사내 보고서 작성</w:t>
-            </w:r>
-          </w:p>
-        </w:tc>
-        <w:tc>
-          <w:tcPr>
-            <w:tcW w:type="dxa" w:w="1872"/>
-            <w:vAlign w:val="center"/>
-            <w:tcBorders>
-              <w:top w:val="single" w:sz="4" w:color="D9D9D9"/>
-              <w:left w:val="single" w:sz="4" w:color="D9D9D9"/>
-              <w:bottom w:val="single" w:sz="4" w:color="D9D9D9"/>
-              <w:right w:val="single" w:sz="4" w:color="D9D9D9"/>
-            </w:tcBorders>
-            <w:shd w:fill="FFFFFF"/>
-            <w:tcMar>
-              <w:top w:w="75" w:type="dxa"/>
-              <w:left w:w="75" w:type="dxa"/>
-              <w:bottom w:w="75" w:type="dxa"/>
-              <w:right w:w="75" w:type="dxa"/>
-            </w:tcMar>
-          </w:tcPr>
-          <w:p>
-            <w:pPr>
-              <w:spacing w:after="20" w:line="252" w:lineRule="auto"/>
-              <w:jc w:val="center"/>
-            </w:pPr>
-            <w:r>
-              <w:rPr>
-                <w:b w:val="0"/>
-                <w:sz w:val="18"/>
-              </w:rPr>
-              <w:t>12</w:t>
-            </w:r>
-          </w:p>
-        </w:tc>
-        <w:tc>
-          <w:tcPr>
-            <w:tcW w:type="dxa" w:w="2736"/>
-            <w:vAlign w:val="center"/>
-            <w:tcBorders>
-              <w:top w:val="single" w:sz="4" w:color="D9D9D9"/>
-              <w:left w:val="single" w:sz="4" w:color="D9D9D9"/>
-              <w:bottom w:val="single" w:sz="4" w:color="D9D9D9"/>
-              <w:right w:val="single" w:sz="4" w:color="D9D9D9"/>
-            </w:tcBorders>
-            <w:shd w:fill="FFFFFF"/>
-            <w:tcMar>
-              <w:top w:w="75" w:type="dxa"/>
-              <w:left w:w="75" w:type="dxa"/>
-              <w:bottom w:w="75" w:type="dxa"/>
-              <w:right w:w="75" w:type="dxa"/>
-            </w:tcMar>
-          </w:tcPr>
-          <w:p>
-            <w:pPr>
-              <w:spacing w:after="20" w:line="252" w:lineRule="auto"/>
-            </w:pPr>
-            <w:r>
-              <w:rPr>
-                <w:b w:val="0"/>
-                <w:sz w:val="18"/>
-              </w:rPr>
-              <w:t>3.7</w:t>
-            </w:r>
-          </w:p>
-        </w:tc>
-      </w:tr>
-      <w:tr>
-        <w:tc>
-          <w:tcPr>
-            <w:tcW w:type="dxa" w:w="5616"/>
-            <w:vAlign w:val="center"/>
-            <w:tcBorders>
-              <w:top w:val="single" w:sz="4" w:color="D9D9D9"/>
-              <w:left w:val="single" w:sz="4" w:color="D9D9D9"/>
-              <w:bottom w:val="single" w:sz="4" w:color="D9D9D9"/>
-              <w:right w:val="single" w:sz="4" w:color="D9D9D9"/>
-            </w:tcBorders>
-            <w:shd w:fill="FFFFFF"/>
-            <w:tcMar>
-              <w:top w:w="75" w:type="dxa"/>
-              <w:left w:w="75" w:type="dxa"/>
-              <w:bottom w:w="75" w:type="dxa"/>
-              <w:right w:w="75" w:type="dxa"/>
-            </w:tcMar>
-          </w:tcPr>
-          <w:p>
-            <w:pPr>
-              <w:spacing w:after="20" w:line="252" w:lineRule="auto"/>
-            </w:pPr>
-            <w:r>
-              <w:rPr>
-                <w:b w:val="0"/>
-                <w:sz w:val="18"/>
-              </w:rPr>
-              <w:t>AI 교육콘텐츠 검수</w:t>
-            </w:r>
-          </w:p>
-        </w:tc>
-        <w:tc>
-          <w:tcPr>
-            <w:tcW w:type="dxa" w:w="1872"/>
-            <w:vAlign w:val="center"/>
-            <w:tcBorders>
-              <w:top w:val="single" w:sz="4" w:color="D9D9D9"/>
-              <w:left w:val="single" w:sz="4" w:color="D9D9D9"/>
-              <w:bottom w:val="single" w:sz="4" w:color="D9D9D9"/>
-              <w:right w:val="single" w:sz="4" w:color="D9D9D9"/>
-            </w:tcBorders>
-            <w:shd w:fill="FFFFFF"/>
-            <w:tcMar>
-              <w:top w:w="75" w:type="dxa"/>
-              <w:left w:w="75" w:type="dxa"/>
-              <w:bottom w:w="75" w:type="dxa"/>
-              <w:right w:w="75" w:type="dxa"/>
-            </w:tcMar>
-          </w:tcPr>
-          <w:p>
-            <w:pPr>
-              <w:spacing w:after="20" w:line="252" w:lineRule="auto"/>
-              <w:jc w:val="center"/>
-            </w:pPr>
-            <w:r>
-              <w:rPr>
-                <w:b w:val="0"/>
-                <w:sz w:val="18"/>
-              </w:rPr>
-              <w:t>6</w:t>
-            </w:r>
-          </w:p>
-        </w:tc>
-        <w:tc>
-          <w:tcPr>
-            <w:tcW w:type="dxa" w:w="2736"/>
-            <w:vAlign w:val="center"/>
-            <w:tcBorders>
-              <w:top w:val="single" w:sz="4" w:color="D9D9D9"/>
-              <w:left w:val="single" w:sz="4" w:color="D9D9D9"/>
-              <w:bottom w:val="single" w:sz="4" w:color="D9D9D9"/>
-              <w:right w:val="single" w:sz="4" w:color="D9D9D9"/>
-            </w:tcBorders>
-            <w:shd w:fill="FFFFFF"/>
-            <w:tcMar>
-              <w:top w:w="75" w:type="dxa"/>
-              <w:left w:w="75" w:type="dxa"/>
-              <w:bottom w:w="75" w:type="dxa"/>
-              <w:right w:w="75" w:type="dxa"/>
-            </w:tcMar>
-          </w:tcPr>
-          <w:p>
-            <w:pPr>
-              <w:spacing w:after="20" w:line="252" w:lineRule="auto"/>
-            </w:pPr>
-            <w:r>
-              <w:rPr>
-                <w:b w:val="0"/>
-                <w:sz w:val="18"/>
-              </w:rPr>
-              <w:t>3.0</w:t>
-            </w:r>
-          </w:p>
-        </w:tc>
-      </w:tr>
-      <w:tr>
-        <w:tc>
-          <w:tcPr>
-            <w:tcW w:type="dxa" w:w="5616"/>
-            <w:vAlign w:val="center"/>
-            <w:tcBorders>
-              <w:top w:val="single" w:sz="4" w:color="D9D9D9"/>
-              <w:left w:val="single" w:sz="4" w:color="D9D9D9"/>
-              <w:bottom w:val="single" w:sz="4" w:color="D9D9D9"/>
-              <w:right w:val="single" w:sz="4" w:color="D9D9D9"/>
-            </w:tcBorders>
-            <w:shd w:fill="FFFFFF"/>
-            <w:tcMar>
-              <w:top w:w="75" w:type="dxa"/>
-              <w:left w:w="75" w:type="dxa"/>
-              <w:bottom w:w="75" w:type="dxa"/>
-              <w:right w:w="75" w:type="dxa"/>
-            </w:tcMar>
-          </w:tcPr>
-          <w:p>
-            <w:pPr>
-              <w:spacing w:after="20" w:line="252" w:lineRule="auto"/>
-            </w:pPr>
-            <w:r>
-              <w:rPr>
-                <w:b w:val="0"/>
-                <w:sz w:val="18"/>
-              </w:rPr>
-              <w:t>AI 제작·운영 업무</w:t>
-            </w:r>
-          </w:p>
-        </w:tc>
-        <w:tc>
-          <w:tcPr>
-            <w:tcW w:type="dxa" w:w="1872"/>
-            <w:vAlign w:val="center"/>
-            <w:tcBorders>
-              <w:top w:val="single" w:sz="4" w:color="D9D9D9"/>
-              <w:left w:val="single" w:sz="4" w:color="D9D9D9"/>
-              <w:bottom w:val="single" w:sz="4" w:color="D9D9D9"/>
-              <w:right w:val="single" w:sz="4" w:color="D9D9D9"/>
-            </w:tcBorders>
-            <w:shd w:fill="FFFFFF"/>
-            <w:tcMar>
-              <w:top w:w="75" w:type="dxa"/>
-              <w:left w:w="75" w:type="dxa"/>
-              <w:bottom w:w="75" w:type="dxa"/>
-              <w:right w:w="75" w:type="dxa"/>
-            </w:tcMar>
-          </w:tcPr>
-          <w:p>
-            <w:pPr>
-              <w:spacing w:after="20" w:line="252" w:lineRule="auto"/>
-              <w:jc w:val="center"/>
-            </w:pPr>
-            <w:r>
-              <w:rPr>
-                <w:b w:val="0"/>
-                <w:sz w:val="18"/>
-              </w:rPr>
-              <w:t>8</w:t>
-            </w:r>
-          </w:p>
-        </w:tc>
-        <w:tc>
-          <w:tcPr>
-            <w:tcW w:type="dxa" w:w="2736"/>
-            <w:vAlign w:val="center"/>
-            <w:tcBorders>
-              <w:top w:val="single" w:sz="4" w:color="D9D9D9"/>
-              <w:left w:val="single" w:sz="4" w:color="D9D9D9"/>
-              <w:bottom w:val="single" w:sz="4" w:color="D9D9D9"/>
-              <w:right w:val="single" w:sz="4" w:color="D9D9D9"/>
-            </w:tcBorders>
-            <w:shd w:fill="FFFFFF"/>
-            <w:tcMar>
-              <w:top w:w="75" w:type="dxa"/>
-              <w:left w:w="75" w:type="dxa"/>
-              <w:bottom w:w="75" w:type="dxa"/>
-              <w:right w:w="75" w:type="dxa"/>
-            </w:tcMar>
-          </w:tcPr>
-          <w:p>
-            <w:pPr>
-              <w:spacing w:after="20" w:line="252" w:lineRule="auto"/>
-            </w:pPr>
-            <w:r>
-              <w:rPr>
-                <w:b w:val="0"/>
-                <w:sz w:val="18"/>
-              </w:rPr>
-              <w:t>4.0</w:t>
-            </w:r>
-          </w:p>
-        </w:tc>
-      </w:tr>
-      <w:tr>
-        <w:tc>
-          <w:tcPr>
-            <w:tcW w:type="dxa" w:w="5616"/>
-            <w:vAlign w:val="center"/>
-            <w:tcBorders>
-              <w:top w:val="single" w:sz="4" w:color="D9D9D9"/>
-              <w:left w:val="single" w:sz="4" w:color="D9D9D9"/>
-              <w:bottom w:val="single" w:sz="4" w:color="D9D9D9"/>
-              <w:right w:val="single" w:sz="4" w:color="D9D9D9"/>
-            </w:tcBorders>
-            <w:shd w:fill="FFFFFF"/>
-            <w:tcMar>
-              <w:top w:w="75" w:type="dxa"/>
-              <w:left w:w="75" w:type="dxa"/>
-              <w:bottom w:w="75" w:type="dxa"/>
-              <w:right w:w="75" w:type="dxa"/>
-            </w:tcMar>
-          </w:tcPr>
-          <w:p>
-            <w:pPr>
-              <w:spacing w:after="20" w:line="252" w:lineRule="auto"/>
-            </w:pPr>
-            <w:r>
-              <w:rPr>
-                <w:b w:val="0"/>
-                <w:sz w:val="18"/>
-              </w:rPr>
-              <w:t>AI 고객응대 실무</w:t>
-            </w:r>
-          </w:p>
-        </w:tc>
-        <w:tc>
-          <w:tcPr>
-            <w:tcW w:type="dxa" w:w="1872"/>
-            <w:vAlign w:val="center"/>
-            <w:tcBorders>
-              <w:top w:val="single" w:sz="4" w:color="D9D9D9"/>
-              <w:left w:val="single" w:sz="4" w:color="D9D9D9"/>
-              <w:bottom w:val="single" w:sz="4" w:color="D9D9D9"/>
-              <w:right w:val="single" w:sz="4" w:color="D9D9D9"/>
-            </w:tcBorders>
-            <w:shd w:fill="FFFFFF"/>
-            <w:tcMar>
-              <w:top w:w="75" w:type="dxa"/>
-              <w:left w:w="75" w:type="dxa"/>
-              <w:bottom w:w="75" w:type="dxa"/>
-              <w:right w:w="75" w:type="dxa"/>
-            </w:tcMar>
-          </w:tcPr>
-          <w:p>
-            <w:pPr>
-              <w:spacing w:after="20" w:line="252" w:lineRule="auto"/>
-              <w:jc w:val="center"/>
-            </w:pPr>
-            <w:r>
-              <w:rPr>
-                <w:b w:val="0"/>
-                <w:sz w:val="18"/>
-              </w:rPr>
-              <w:t>6</w:t>
-            </w:r>
-          </w:p>
-        </w:tc>
-        <w:tc>
-          <w:tcPr>
-            <w:tcW w:type="dxa" w:w="2736"/>
-            <w:vAlign w:val="center"/>
-            <w:tcBorders>
-              <w:top w:val="single" w:sz="4" w:color="D9D9D9"/>
-              <w:left w:val="single" w:sz="4" w:color="D9D9D9"/>
-              <w:bottom w:val="single" w:sz="4" w:color="D9D9D9"/>
-              <w:right w:val="single" w:sz="4" w:color="D9D9D9"/>
-            </w:tcBorders>
-            <w:shd w:fill="FFFFFF"/>
-            <w:tcMar>
-              <w:top w:w="75" w:type="dxa"/>
-              <w:left w:w="75" w:type="dxa"/>
-              <w:bottom w:w="75" w:type="dxa"/>
-              <w:right w:w="75" w:type="dxa"/>
-            </w:tcMar>
-          </w:tcPr>
-          <w:p>
-            <w:pPr>
-              <w:spacing w:after="20" w:line="252" w:lineRule="auto"/>
-            </w:pPr>
-            <w:r>
-              <w:rPr>
-                <w:b w:val="0"/>
-                <w:sz w:val="18"/>
-              </w:rPr>
-              <w:t>4.3</w:t>
-            </w:r>
-          </w:p>
-        </w:tc>
-      </w:tr>
-    </w:tbl>
-    <w:p>
       <w:r>
-        <w:br w:type="page"/>
+        <w:rPr>
+          <w:rFonts w:ascii="맑은 고딕" w:hAnsi="맑은 고딕" w:eastAsia="맑은 고딕"/>
+          <w:b w:val="0"/>
+        </w:rPr>
+        <w:t xml:space="preserve"> — 전체적으로 양호</w:t>
       </w:r>
     </w:p>
     <w:p>
       <w:pPr>
-        <w:pStyle w:val="Heading1"/>
+        <w:ind w:left="283"/>
       </w:pPr>
       <w:r>
+        <w:rPr>
+          <w:rFonts w:ascii="맑은 고딕" w:hAnsi="맑은 고딕" w:eastAsia="맑은 고딕"/>
+          <w:b w:val="0"/>
+        </w:rPr>
+        <w:t xml:space="preserve">• 문항별 최고: </w:t>
+      </w:r>
+      <w:r>
+        <w:rPr>
+          <w:rFonts w:ascii="맑은 고딕" w:hAnsi="맑은 고딕" w:eastAsia="맑은 고딕"/>
+          <w:b/>
+        </w:rPr>
+        <w:t>실무 적용 가능성 4.3점</w:t>
+      </w:r>
+      <w:r>
+        <w:rPr>
+          <w:rFonts w:ascii="맑은 고딕" w:hAnsi="맑은 고딕" w:eastAsia="맑은 고딕"/>
+          <w:b w:val="0"/>
+        </w:rPr>
+        <w:t xml:space="preserve"> (참여자들이 가장 높게 평가)</w:t>
+      </w:r>
+    </w:p>
+    <w:p>
+      <w:pPr>
+        <w:ind w:left="283"/>
+      </w:pPr>
+      <w:r>
+        <w:rPr>
+          <w:rFonts w:ascii="맑은 고딕" w:hAnsi="맑은 고딕" w:eastAsia="맑은 고딕"/>
+          <w:b w:val="0"/>
+        </w:rPr>
+        <w:t xml:space="preserve">• 문항별 최저: </w:t>
+      </w:r>
+      <w:r>
+        <w:rPr>
+          <w:rFonts w:ascii="맑은 고딕" w:hAnsi="맑은 고딕" w:eastAsia="맑은 고딕"/>
+          <w:b/>
+        </w:rPr>
+        <w:t>교육 환경 3.1점</w:t>
+      </w:r>
+      <w:r>
+        <w:rPr>
+          <w:rFonts w:ascii="맑은 고딕" w:hAnsi="맑은 고딕" w:eastAsia="맑은 고딕"/>
+          <w:b w:val="0"/>
+        </w:rPr>
+        <w:t xml:space="preserve"> (전 과정 공통으로 낮음 — 시설·장비 요인)</w:t>
+      </w:r>
+    </w:p>
+    <w:p>
+      <w:pPr>
+        <w:ind w:left="283"/>
+      </w:pPr>
+      <w:r>
+        <w:rPr>
+          <w:rFonts w:ascii="맑은 고딕" w:hAnsi="맑은 고딕" w:eastAsia="맑은 고딕"/>
+          <w:b w:val="0"/>
+        </w:rPr>
+        <w:t xml:space="preserve">• 과정별 최고: </w:t>
+      </w:r>
+      <w:r>
+        <w:rPr>
+          <w:rFonts w:ascii="맑은 고딕" w:hAnsi="맑은 고딕" w:eastAsia="맑은 고딕"/>
+          <w:b/>
+        </w:rPr>
+        <w:t>AI 활용 실무 4.5점</w:t>
+      </w:r>
+      <w:r>
+        <w:rPr>
+          <w:rFonts w:ascii="맑은 고딕" w:hAnsi="맑은 고딕" w:eastAsia="맑은 고딕"/>
+          <w:b w:val="0"/>
+        </w:rPr>
+        <w:t xml:space="preserve"> (26명 참여, 최다 인원·최고 만족)</w:t>
+      </w:r>
+    </w:p>
+    <w:p>
+      <w:pPr>
+        <w:ind w:left="283"/>
+      </w:pPr>
+      <w:r>
+        <w:rPr>
+          <w:rFonts w:ascii="맑은 고딕" w:hAnsi="맑은 고딕" w:eastAsia="맑은 고딕"/>
+          <w:b w:val="0"/>
+        </w:rPr>
+        <w:t>• 과정별 하위: 정보보안 실무 3.0점 · 비즈니스 문서 작성 심화 3.7점 (내용 구성 문항도 동반 하락)</w:t>
+      </w:r>
+    </w:p>
+    <w:p>
+      <w:pPr>
+        <w:spacing w:before="200"/>
+      </w:pPr>
+      <w:r>
+        <w:rPr>
+          <w:rFonts w:ascii="맑은 고딕" w:hAnsi="맑은 고딕" w:eastAsia="맑은 고딕"/>
+          <w:b/>
+          <w:color w:val="153C78"/>
+          <w:sz w:val="24"/>
+        </w:rPr>
         <w:t>3. 자유 의견 분석 (38건)</w:t>
       </w:r>
     </w:p>
     <w:tbl>
       <w:tblPr>
+        <w:tblStyle w:val="TableGrid"/>
         <w:tblW w:type="auto" w:w="0"/>
-        <w:tblLayout w:type="fixed"/>
         <w:tblLook w:firstColumn="1" w:firstRow="1" w:lastColumn="0" w:lastRow="0" w:noHBand="0" w:noVBand="1" w:val="04A0"/>
       </w:tblPr>
       <w:tblGrid>
-        <w:gridCol w:w="3408"/>
-        <w:gridCol w:w="3408"/>
-        <w:gridCol w:w="3408"/>
+        <w:gridCol w:w="3249"/>
+        <w:gridCol w:w="3249"/>
+        <w:gridCol w:w="3249"/>
       </w:tblGrid>
       <w:tr>
-        <w:trPr>
-          <w:tblHeader/>
-        </w:trPr>
         <w:tc>
           <w:tcPr>
-            <w:tcW w:type="dxa" w:w="1800"/>
-            <w:vAlign w:val="center"/>
-            <w:tcBorders>
-              <w:top w:val="single" w:sz="4" w:color="D9D9D9"/>
-              <w:left w:val="single" w:sz="4" w:color="D9D9D9"/>
-              <w:bottom w:val="single" w:sz="4" w:color="D9D9D9"/>
-              <w:right w:val="single" w:sz="4" w:color="D9D9D9"/>
-            </w:tcBorders>
-            <w:shd w:fill="DCE6F1"/>
-            <w:tcMar>
-              <w:top w:w="75" w:type="dxa"/>
-              <w:left w:w="75" w:type="dxa"/>
-              <w:bottom w:w="75" w:type="dxa"/>
-              <w:right w:w="75" w:type="dxa"/>
-            </w:tcMar>
+            <w:tcW w:type="dxa" w:w="3249"/>
           </w:tcPr>
           <w:p>
-            <w:pPr>
-              <w:spacing w:after="20" w:line="252" w:lineRule="auto"/>
-            </w:pPr>
+            <w:r/>
             <w:r>
               <w:rPr>
+                <w:rFonts w:ascii="맑은 고딕" w:hAnsi="맑은 고딕" w:eastAsia="맑은 고딕"/>
                 <w:b/>
-                <w:sz w:val="18"/>
+                <w:color w:val="153C78"/>
+                <w:sz w:val="19"/>
               </w:rPr>
               <w:t>유형</w:t>
             </w:r>
@@ -817,31 +295,16 @@
         </w:tc>
         <w:tc>
           <w:tcPr>
-            <w:tcW w:type="dxa" w:w="720"/>
-            <w:vAlign w:val="center"/>
-            <w:tcBorders>
-              <w:top w:val="single" w:sz="4" w:color="D9D9D9"/>
-              <w:left w:val="single" w:sz="4" w:color="D9D9D9"/>
-              <w:bottom w:val="single" w:sz="4" w:color="D9D9D9"/>
-              <w:right w:val="single" w:sz="4" w:color="D9D9D9"/>
-            </w:tcBorders>
-            <w:shd w:fill="DCE6F1"/>
-            <w:tcMar>
-              <w:top w:w="75" w:type="dxa"/>
-              <w:left w:w="75" w:type="dxa"/>
-              <w:bottom w:w="75" w:type="dxa"/>
-              <w:right w:w="75" w:type="dxa"/>
-            </w:tcMar>
+            <w:tcW w:type="dxa" w:w="3249"/>
           </w:tcPr>
           <w:p>
-            <w:pPr>
-              <w:spacing w:after="20" w:line="252" w:lineRule="auto"/>
-              <w:jc w:val="center"/>
-            </w:pPr>
+            <w:r/>
             <w:r>
               <w:rPr>
+                <w:rFonts w:ascii="맑은 고딕" w:hAnsi="맑은 고딕" w:eastAsia="맑은 고딕"/>
                 <w:b/>
-                <w:sz w:val="18"/>
+                <w:color w:val="153C78"/>
+                <w:sz w:val="19"/>
               </w:rPr>
               <w:t>건수</w:t>
             </w:r>
@@ -849,30 +312,16 @@
         </w:tc>
         <w:tc>
           <w:tcPr>
-            <w:tcW w:type="dxa" w:w="7704"/>
-            <w:vAlign w:val="center"/>
-            <w:tcBorders>
-              <w:top w:val="single" w:sz="4" w:color="D9D9D9"/>
-              <w:left w:val="single" w:sz="4" w:color="D9D9D9"/>
-              <w:bottom w:val="single" w:sz="4" w:color="D9D9D9"/>
-              <w:right w:val="single" w:sz="4" w:color="D9D9D9"/>
-            </w:tcBorders>
-            <w:shd w:fill="DCE6F1"/>
-            <w:tcMar>
-              <w:top w:w="75" w:type="dxa"/>
-              <w:left w:w="75" w:type="dxa"/>
-              <w:bottom w:w="75" w:type="dxa"/>
-              <w:right w:w="75" w:type="dxa"/>
-            </w:tcMar>
+            <w:tcW w:type="dxa" w:w="3249"/>
           </w:tcPr>
           <w:p>
-            <w:pPr>
-              <w:spacing w:after="20" w:line="252" w:lineRule="auto"/>
-            </w:pPr>
+            <w:r/>
             <w:r>
               <w:rPr>
+                <w:rFonts w:ascii="맑은 고딕" w:hAnsi="맑은 고딕" w:eastAsia="맑은 고딕"/>
                 <w:b/>
-                <w:sz w:val="18"/>
+                <w:color w:val="153C78"/>
+                <w:sz w:val="19"/>
               </w:rPr>
               <w:t>대표 의견</w:t>
             </w:r>
@@ -882,95 +331,49 @@
       <w:tr>
         <w:tc>
           <w:tcPr>
-            <w:tcW w:type="dxa" w:w="1800"/>
-            <w:vAlign w:val="center"/>
-            <w:tcBorders>
-              <w:top w:val="single" w:sz="4" w:color="D9D9D9"/>
-              <w:left w:val="single" w:sz="4" w:color="D9D9D9"/>
-              <w:bottom w:val="single" w:sz="4" w:color="D9D9D9"/>
-              <w:right w:val="single" w:sz="4" w:color="D9D9D9"/>
-            </w:tcBorders>
-            <w:shd w:fill="FFFFFF"/>
-            <w:tcMar>
-              <w:top w:w="75" w:type="dxa"/>
-              <w:left w:w="75" w:type="dxa"/>
-              <w:bottom w:w="75" w:type="dxa"/>
-              <w:right w:w="75" w:type="dxa"/>
-            </w:tcMar>
+            <w:tcW w:type="dxa" w:w="3249"/>
           </w:tcPr>
           <w:p>
-            <w:pPr>
-              <w:spacing w:after="20" w:line="252" w:lineRule="auto"/>
-            </w:pPr>
+            <w:r/>
             <w:r>
               <w:rPr>
+                <w:rFonts w:ascii="맑은 고딕" w:hAnsi="맑은 고딕" w:eastAsia="맑은 고딕"/>
                 <w:b w:val="0"/>
-                <w:sz w:val="18"/>
+                <w:sz w:val="19"/>
               </w:rPr>
-              <w:t>실습 시간 확대</w:t>
+              <w:t>실습 시간 부족</w:t>
             </w:r>
           </w:p>
         </w:tc>
         <w:tc>
           <w:tcPr>
-            <w:tcW w:type="dxa" w:w="720"/>
-            <w:vAlign w:val="center"/>
-            <w:tcBorders>
-              <w:top w:val="single" w:sz="4" w:color="D9D9D9"/>
-              <w:left w:val="single" w:sz="4" w:color="D9D9D9"/>
-              <w:bottom w:val="single" w:sz="4" w:color="D9D9D9"/>
-              <w:right w:val="single" w:sz="4" w:color="D9D9D9"/>
-            </w:tcBorders>
-            <w:shd w:fill="FFFFFF"/>
-            <w:tcMar>
-              <w:top w:w="75" w:type="dxa"/>
-              <w:left w:w="75" w:type="dxa"/>
-              <w:bottom w:w="75" w:type="dxa"/>
-              <w:right w:w="75" w:type="dxa"/>
-            </w:tcMar>
+            <w:tcW w:type="dxa" w:w="3249"/>
           </w:tcPr>
           <w:p>
-            <w:pPr>
-              <w:spacing w:after="20" w:line="252" w:lineRule="auto"/>
-              <w:jc w:val="center"/>
-            </w:pPr>
+            <w:r/>
             <w:r>
               <w:rPr>
+                <w:rFonts w:ascii="맑은 고딕" w:hAnsi="맑은 고딕" w:eastAsia="맑은 고딕"/>
                 <w:b w:val="0"/>
-                <w:sz w:val="18"/>
+                <w:sz w:val="19"/>
               </w:rPr>
-              <w:t>11</w:t>
+              <w:t>11건</w:t>
             </w:r>
           </w:p>
         </w:tc>
         <w:tc>
           <w:tcPr>
-            <w:tcW w:type="dxa" w:w="7704"/>
-            <w:vAlign w:val="center"/>
-            <w:tcBorders>
-              <w:top w:val="single" w:sz="4" w:color="D9D9D9"/>
-              <w:left w:val="single" w:sz="4" w:color="D9D9D9"/>
-              <w:bottom w:val="single" w:sz="4" w:color="D9D9D9"/>
-              <w:right w:val="single" w:sz="4" w:color="D9D9D9"/>
-            </w:tcBorders>
-            <w:shd w:fill="FFFFFF"/>
-            <w:tcMar>
-              <w:top w:w="75" w:type="dxa"/>
-              <w:left w:w="75" w:type="dxa"/>
-              <w:bottom w:w="75" w:type="dxa"/>
-              <w:right w:w="75" w:type="dxa"/>
-            </w:tcMar>
+            <w:tcW w:type="dxa" w:w="3249"/>
           </w:tcPr>
           <w:p>
-            <w:pPr>
-              <w:spacing w:after="20" w:line="252" w:lineRule="auto"/>
-            </w:pPr>
+            <w:r/>
             <w:r>
               <w:rPr>
+                <w:rFonts w:ascii="맑은 고딕" w:hAnsi="맑은 고딕" w:eastAsia="맑은 고딕"/>
                 <w:b w:val="0"/>
-                <w:sz w:val="18"/>
+                <w:sz w:val="19"/>
               </w:rPr>
-              <w:t>“프롬프트를 업무에 맞게 수정하는 실습 시간이 부족했습니다. 직접 따라 할 시간을 늘려주세요.”</w:t>
+              <w:t>"따라 하다 보면 끝나 있어요" — 대부분 AI·데이터 과정에 집중</w:t>
             </w:r>
           </w:p>
         </w:tc>
@@ -978,95 +381,49 @@
       <w:tr>
         <w:tc>
           <w:tcPr>
-            <w:tcW w:type="dxa" w:w="1800"/>
-            <w:vAlign w:val="center"/>
-            <w:tcBorders>
-              <w:top w:val="single" w:sz="4" w:color="D9D9D9"/>
-              <w:left w:val="single" w:sz="4" w:color="D9D9D9"/>
-              <w:bottom w:val="single" w:sz="4" w:color="D9D9D9"/>
-              <w:right w:val="single" w:sz="4" w:color="D9D9D9"/>
-            </w:tcBorders>
-            <w:shd w:fill="FFFFFF"/>
-            <w:tcMar>
-              <w:top w:w="75" w:type="dxa"/>
-              <w:left w:w="75" w:type="dxa"/>
-              <w:bottom w:w="75" w:type="dxa"/>
-              <w:right w:w="75" w:type="dxa"/>
-            </w:tcMar>
+            <w:tcW w:type="dxa" w:w="3249"/>
           </w:tcPr>
           <w:p>
-            <w:pPr>
-              <w:spacing w:after="20" w:line="252" w:lineRule="auto"/>
-            </w:pPr>
+            <w:r/>
             <w:r>
               <w:rPr>
+                <w:rFonts w:ascii="맑은 고딕" w:hAnsi="맑은 고딕" w:eastAsia="맑은 고딕"/>
                 <w:b w:val="0"/>
-                <w:sz w:val="18"/>
+                <w:sz w:val="19"/>
               </w:rPr>
-              <w:t>교육 환경 개선</w:t>
+              <w:t>교육 환경 불만</w:t>
             </w:r>
           </w:p>
         </w:tc>
         <w:tc>
           <w:tcPr>
-            <w:tcW w:type="dxa" w:w="720"/>
-            <w:vAlign w:val="center"/>
-            <w:tcBorders>
-              <w:top w:val="single" w:sz="4" w:color="D9D9D9"/>
-              <w:left w:val="single" w:sz="4" w:color="D9D9D9"/>
-              <w:bottom w:val="single" w:sz="4" w:color="D9D9D9"/>
-              <w:right w:val="single" w:sz="4" w:color="D9D9D9"/>
-            </w:tcBorders>
-            <w:shd w:fill="FFFFFF"/>
-            <w:tcMar>
-              <w:top w:w="75" w:type="dxa"/>
-              <w:left w:w="75" w:type="dxa"/>
-              <w:bottom w:w="75" w:type="dxa"/>
-              <w:right w:w="75" w:type="dxa"/>
-            </w:tcMar>
+            <w:tcW w:type="dxa" w:w="3249"/>
           </w:tcPr>
           <w:p>
-            <w:pPr>
-              <w:spacing w:after="20" w:line="252" w:lineRule="auto"/>
-              <w:jc w:val="center"/>
-            </w:pPr>
+            <w:r/>
             <w:r>
               <w:rPr>
+                <w:rFonts w:ascii="맑은 고딕" w:hAnsi="맑은 고딕" w:eastAsia="맑은 고딕"/>
                 <w:b w:val="0"/>
-                <w:sz w:val="18"/>
+                <w:sz w:val="19"/>
               </w:rPr>
-              <w:t>8</w:t>
+              <w:t>8건</w:t>
             </w:r>
           </w:p>
         </w:tc>
         <w:tc>
           <w:tcPr>
-            <w:tcW w:type="dxa" w:w="7704"/>
-            <w:vAlign w:val="center"/>
-            <w:tcBorders>
-              <w:top w:val="single" w:sz="4" w:color="D9D9D9"/>
-              <w:left w:val="single" w:sz="4" w:color="D9D9D9"/>
-              <w:bottom w:val="single" w:sz="4" w:color="D9D9D9"/>
-              <w:right w:val="single" w:sz="4" w:color="D9D9D9"/>
-            </w:tcBorders>
-            <w:shd w:fill="FFFFFF"/>
-            <w:tcMar>
-              <w:top w:w="75" w:type="dxa"/>
-              <w:left w:w="75" w:type="dxa"/>
-              <w:bottom w:w="75" w:type="dxa"/>
-              <w:right w:w="75" w:type="dxa"/>
-            </w:tcMar>
+            <w:tcW w:type="dxa" w:w="3249"/>
           </w:tcPr>
           <w:p>
-            <w:pPr>
-              <w:spacing w:after="20" w:line="252" w:lineRule="auto"/>
-            </w:pPr>
+            <w:r/>
             <w:r>
               <w:rPr>
+                <w:rFonts w:ascii="맑은 고딕" w:hAnsi="맑은 고딕" w:eastAsia="맑은 고딕"/>
                 <w:b w:val="0"/>
-                <w:sz w:val="18"/>
+                <w:sz w:val="19"/>
               </w:rPr>
-              <w:t>“의자가 불편하고 실내가 더웠습니다.”</w:t>
+              <w:t>교육장 PC 속도·화면 크기·네트워크</w:t>
             </w:r>
           </w:p>
         </w:tc>
@@ -1074,30 +431,15 @@
       <w:tr>
         <w:tc>
           <w:tcPr>
-            <w:tcW w:type="dxa" w:w="1800"/>
-            <w:vAlign w:val="center"/>
-            <w:tcBorders>
-              <w:top w:val="single" w:sz="4" w:color="D9D9D9"/>
-              <w:left w:val="single" w:sz="4" w:color="D9D9D9"/>
-              <w:bottom w:val="single" w:sz="4" w:color="D9D9D9"/>
-              <w:right w:val="single" w:sz="4" w:color="D9D9D9"/>
-            </w:tcBorders>
-            <w:shd w:fill="FFFFFF"/>
-            <w:tcMar>
-              <w:top w:w="75" w:type="dxa"/>
-              <w:left w:w="75" w:type="dxa"/>
-              <w:bottom w:w="75" w:type="dxa"/>
-              <w:right w:w="75" w:type="dxa"/>
-            </w:tcMar>
+            <w:tcW w:type="dxa" w:w="3249"/>
           </w:tcPr>
           <w:p>
-            <w:pPr>
-              <w:spacing w:after="20" w:line="252" w:lineRule="auto"/>
-            </w:pPr>
+            <w:r/>
             <w:r>
               <w:rPr>
+                <w:rFonts w:ascii="맑은 고딕" w:hAnsi="맑은 고딕" w:eastAsia="맑은 고딕"/>
                 <w:b w:val="0"/>
-                <w:sz w:val="18"/>
+                <w:sz w:val="19"/>
               </w:rPr>
               <w:t>긍정 평가</w:t>
             </w:r>
@@ -1105,64 +447,33 @@
         </w:tc>
         <w:tc>
           <w:tcPr>
-            <w:tcW w:type="dxa" w:w="720"/>
-            <w:vAlign w:val="center"/>
-            <w:tcBorders>
-              <w:top w:val="single" w:sz="4" w:color="D9D9D9"/>
-              <w:left w:val="single" w:sz="4" w:color="D9D9D9"/>
-              <w:bottom w:val="single" w:sz="4" w:color="D9D9D9"/>
-              <w:right w:val="single" w:sz="4" w:color="D9D9D9"/>
-            </w:tcBorders>
-            <w:shd w:fill="FFFFFF"/>
-            <w:tcMar>
-              <w:top w:w="75" w:type="dxa"/>
-              <w:left w:w="75" w:type="dxa"/>
-              <w:bottom w:w="75" w:type="dxa"/>
-              <w:right w:w="75" w:type="dxa"/>
-            </w:tcMar>
+            <w:tcW w:type="dxa" w:w="3249"/>
           </w:tcPr>
           <w:p>
-            <w:pPr>
-              <w:spacing w:after="20" w:line="252" w:lineRule="auto"/>
-              <w:jc w:val="center"/>
-            </w:pPr>
+            <w:r/>
             <w:r>
               <w:rPr>
+                <w:rFonts w:ascii="맑은 고딕" w:hAnsi="맑은 고딕" w:eastAsia="맑은 고딕"/>
                 <w:b w:val="0"/>
-                <w:sz w:val="18"/>
+                <w:sz w:val="19"/>
               </w:rPr>
-              <w:t>8</w:t>
+              <w:t>8건</w:t>
             </w:r>
           </w:p>
         </w:tc>
         <w:tc>
           <w:tcPr>
-            <w:tcW w:type="dxa" w:w="7704"/>
-            <w:vAlign w:val="center"/>
-            <w:tcBorders>
-              <w:top w:val="single" w:sz="4" w:color="D9D9D9"/>
-              <w:left w:val="single" w:sz="4" w:color="D9D9D9"/>
-              <w:bottom w:val="single" w:sz="4" w:color="D9D9D9"/>
-              <w:right w:val="single" w:sz="4" w:color="D9D9D9"/>
-            </w:tcBorders>
-            <w:shd w:fill="FFFFFF"/>
-            <w:tcMar>
-              <w:top w:w="75" w:type="dxa"/>
-              <w:left w:w="75" w:type="dxa"/>
-              <w:bottom w:w="75" w:type="dxa"/>
-              <w:right w:w="75" w:type="dxa"/>
-            </w:tcMar>
+            <w:tcW w:type="dxa" w:w="3249"/>
           </w:tcPr>
           <w:p>
-            <w:pPr>
-              <w:spacing w:after="20" w:line="252" w:lineRule="auto"/>
-            </w:pPr>
+            <w:r/>
             <w:r>
               <w:rPr>
+                <w:rFonts w:ascii="맑은 고딕" w:hAnsi="맑은 고딕" w:eastAsia="맑은 고딕"/>
                 <w:b w:val="0"/>
-                <w:sz w:val="18"/>
+                <w:sz w:val="19"/>
               </w:rPr>
-              <w:t>“제작·운영 데이터를 정리하는 실습이 실제 업무를 떠올리며 배우는 데 도움이 됐습니다.”</w:t>
+              <w:t>"바로 업무에 써먹을 수 있다"</w:t>
             </w:r>
           </w:p>
         </w:tc>
@@ -1170,30 +481,15 @@
       <w:tr>
         <w:tc>
           <w:tcPr>
-            <w:tcW w:type="dxa" w:w="1800"/>
-            <w:vAlign w:val="center"/>
-            <w:tcBorders>
-              <w:top w:val="single" w:sz="4" w:color="D9D9D9"/>
-              <w:left w:val="single" w:sz="4" w:color="D9D9D9"/>
-              <w:bottom w:val="single" w:sz="4" w:color="D9D9D9"/>
-              <w:right w:val="single" w:sz="4" w:color="D9D9D9"/>
-            </w:tcBorders>
-            <w:shd w:fill="FFFFFF"/>
-            <w:tcMar>
-              <w:top w:w="75" w:type="dxa"/>
-              <w:left w:w="75" w:type="dxa"/>
-              <w:bottom w:w="75" w:type="dxa"/>
-              <w:right w:w="75" w:type="dxa"/>
-            </w:tcMar>
+            <w:tcW w:type="dxa" w:w="3249"/>
           </w:tcPr>
           <w:p>
-            <w:pPr>
-              <w:spacing w:after="20" w:line="252" w:lineRule="auto"/>
-            </w:pPr>
+            <w:r/>
             <w:r>
               <w:rPr>
+                <w:rFonts w:ascii="맑은 고딕" w:hAnsi="맑은 고딕" w:eastAsia="맑은 고딕"/>
                 <w:b w:val="0"/>
-                <w:sz w:val="18"/>
+                <w:sz w:val="19"/>
               </w:rPr>
               <w:t>심화 과정 요청</w:t>
             </w:r>
@@ -1201,64 +497,33 @@
         </w:tc>
         <w:tc>
           <w:tcPr>
-            <w:tcW w:type="dxa" w:w="720"/>
-            <w:vAlign w:val="center"/>
-            <w:tcBorders>
-              <w:top w:val="single" w:sz="4" w:color="D9D9D9"/>
-              <w:left w:val="single" w:sz="4" w:color="D9D9D9"/>
-              <w:bottom w:val="single" w:sz="4" w:color="D9D9D9"/>
-              <w:right w:val="single" w:sz="4" w:color="D9D9D9"/>
-            </w:tcBorders>
-            <w:shd w:fill="FFFFFF"/>
-            <w:tcMar>
-              <w:top w:w="75" w:type="dxa"/>
-              <w:left w:w="75" w:type="dxa"/>
-              <w:bottom w:w="75" w:type="dxa"/>
-              <w:right w:w="75" w:type="dxa"/>
-            </w:tcMar>
+            <w:tcW w:type="dxa" w:w="3249"/>
           </w:tcPr>
           <w:p>
-            <w:pPr>
-              <w:spacing w:after="20" w:line="252" w:lineRule="auto"/>
-              <w:jc w:val="center"/>
-            </w:pPr>
+            <w:r/>
             <w:r>
               <w:rPr>
+                <w:rFonts w:ascii="맑은 고딕" w:hAnsi="맑은 고딕" w:eastAsia="맑은 고딕"/>
                 <w:b w:val="0"/>
-                <w:sz w:val="18"/>
+                <w:sz w:val="19"/>
               </w:rPr>
-              <w:t>6</w:t>
+              <w:t>6건</w:t>
             </w:r>
           </w:p>
         </w:tc>
         <w:tc>
           <w:tcPr>
-            <w:tcW w:type="dxa" w:w="7704"/>
-            <w:vAlign w:val="center"/>
-            <w:tcBorders>
-              <w:top w:val="single" w:sz="4" w:color="D9D9D9"/>
-              <w:left w:val="single" w:sz="4" w:color="D9D9D9"/>
-              <w:bottom w:val="single" w:sz="4" w:color="D9D9D9"/>
-              <w:right w:val="single" w:sz="4" w:color="D9D9D9"/>
-            </w:tcBorders>
-            <w:shd w:fill="FFFFFF"/>
-            <w:tcMar>
-              <w:top w:w="75" w:type="dxa"/>
-              <w:left w:w="75" w:type="dxa"/>
-              <w:bottom w:w="75" w:type="dxa"/>
-              <w:right w:w="75" w:type="dxa"/>
-            </w:tcMar>
+            <w:tcW w:type="dxa" w:w="3249"/>
           </w:tcPr>
           <w:p>
-            <w:pPr>
-              <w:spacing w:after="20" w:line="252" w:lineRule="auto"/>
-            </w:pPr>
+            <w:r/>
             <w:r>
               <w:rPr>
+                <w:rFonts w:ascii="맑은 고딕" w:hAnsi="맑은 고딕" w:eastAsia="맑은 고딕"/>
                 <w:b w:val="0"/>
-                <w:sz w:val="18"/>
+                <w:sz w:val="19"/>
               </w:rPr>
-              <w:t>“AI 업무 기본 후속 과정을 열어 직무 사례를 더 깊게 다루면 좋겠습니다.”</w:t>
+              <w:t>AI 과정 후속·시리즈 과정 개설 요구</w:t>
             </w:r>
           </w:p>
         </w:tc>
@@ -1266,164 +531,264 @@
       <w:tr>
         <w:tc>
           <w:tcPr>
-            <w:tcW w:type="dxa" w:w="1800"/>
-            <w:vAlign w:val="center"/>
-            <w:tcBorders>
-              <w:top w:val="single" w:sz="4" w:color="D9D9D9"/>
-              <w:left w:val="single" w:sz="4" w:color="D9D9D9"/>
-              <w:bottom w:val="single" w:sz="4" w:color="D9D9D9"/>
-              <w:right w:val="single" w:sz="4" w:color="D9D9D9"/>
-            </w:tcBorders>
-            <w:shd w:fill="FFFFFF"/>
-            <w:tcMar>
-              <w:top w:w="75" w:type="dxa"/>
-              <w:left w:w="75" w:type="dxa"/>
-              <w:bottom w:w="75" w:type="dxa"/>
-              <w:right w:w="75" w:type="dxa"/>
-            </w:tcMar>
+            <w:tcW w:type="dxa" w:w="3249"/>
           </w:tcPr>
           <w:p>
-            <w:pPr>
-              <w:spacing w:after="20" w:line="252" w:lineRule="auto"/>
-            </w:pPr>
+            <w:r/>
             <w:r>
               <w:rPr>
+                <w:rFonts w:ascii="맑은 고딕" w:hAnsi="맑은 고딕" w:eastAsia="맑은 고딕"/>
                 <w:b w:val="0"/>
-                <w:sz w:val="18"/>
+                <w:sz w:val="19"/>
               </w:rPr>
-              <w:t>내용 구성 개선</w:t>
+              <w:t>내용 중복 지적</w:t>
             </w:r>
           </w:p>
         </w:tc>
         <w:tc>
           <w:tcPr>
-            <w:tcW w:type="dxa" w:w="720"/>
-            <w:vAlign w:val="center"/>
-            <w:tcBorders>
-              <w:top w:val="single" w:sz="4" w:color="D9D9D9"/>
-              <w:left w:val="single" w:sz="4" w:color="D9D9D9"/>
-              <w:bottom w:val="single" w:sz="4" w:color="D9D9D9"/>
-              <w:right w:val="single" w:sz="4" w:color="D9D9D9"/>
-            </w:tcBorders>
-            <w:shd w:fill="FFFFFF"/>
-            <w:tcMar>
-              <w:top w:w="75" w:type="dxa"/>
-              <w:left w:w="75" w:type="dxa"/>
-              <w:bottom w:w="75" w:type="dxa"/>
-              <w:right w:w="75" w:type="dxa"/>
-            </w:tcMar>
+            <w:tcW w:type="dxa" w:w="3249"/>
           </w:tcPr>
           <w:p>
-            <w:pPr>
-              <w:spacing w:after="20" w:line="252" w:lineRule="auto"/>
-              <w:jc w:val="center"/>
-            </w:pPr>
+            <w:r/>
             <w:r>
               <w:rPr>
+                <w:rFonts w:ascii="맑은 고딕" w:hAnsi="맑은 고딕" w:eastAsia="맑은 고딕"/>
                 <w:b w:val="0"/>
-                <w:sz w:val="18"/>
+                <w:sz w:val="19"/>
               </w:rPr>
-              <w:t>5</w:t>
+              <w:t>5건</w:t>
             </w:r>
           </w:p>
         </w:tc>
         <w:tc>
           <w:tcPr>
-            <w:tcW w:type="dxa" w:w="7704"/>
-            <w:vAlign w:val="center"/>
-            <w:tcBorders>
-              <w:top w:val="single" w:sz="4" w:color="D9D9D9"/>
-              <w:left w:val="single" w:sz="4" w:color="D9D9D9"/>
-              <w:bottom w:val="single" w:sz="4" w:color="D9D9D9"/>
-              <w:right w:val="single" w:sz="4" w:color="D9D9D9"/>
-            </w:tcBorders>
-            <w:shd w:fill="FFFFFF"/>
-            <w:tcMar>
-              <w:top w:w="75" w:type="dxa"/>
-              <w:left w:w="75" w:type="dxa"/>
-              <w:bottom w:w="75" w:type="dxa"/>
-              <w:right w:w="75" w:type="dxa"/>
-            </w:tcMar>
+            <w:tcW w:type="dxa" w:w="3249"/>
           </w:tcPr>
           <w:p>
-            <w:pPr>
-              <w:spacing w:after="20" w:line="252" w:lineRule="auto"/>
-            </w:pPr>
+            <w:r/>
             <w:r>
               <w:rPr>
+                <w:rFonts w:ascii="맑은 고딕" w:hAnsi="맑은 고딕" w:eastAsia="맑은 고딕"/>
                 <w:b w:val="0"/>
-                <w:sz w:val="18"/>
+                <w:sz w:val="19"/>
               </w:rPr>
-              <w:t>“직무 사례를 직접 수정하는 시간보다 이론 설명이 많았습니다.”</w:t>
+              <w:t>문서 과정 — 기존 교육과 차별성 부족</w:t>
             </w:r>
           </w:p>
         </w:tc>
       </w:tr>
     </w:tbl>
+    <w:p/>
     <w:p>
       <w:pPr>
-        <w:pStyle w:val="Heading1"/>
+        <w:spacing w:before="200"/>
       </w:pPr>
       <w:r>
+        <w:rPr>
+          <w:rFonts w:ascii="맑은 고딕" w:hAnsi="맑은 고딕" w:eastAsia="맑은 고딕"/>
+          <w:b/>
+          <w:color w:val="153C78"/>
+          <w:sz w:val="24"/>
+        </w:rPr>
         <w:t>4. 진단</w:t>
       </w:r>
     </w:p>
     <w:p>
+      <w:pPr>
+        <w:ind w:left="283"/>
+      </w:pPr>
       <w:r>
-        <w:t>실무 적용성 4.3점과 실습 시간 확대 의견 11건은 직무에 직접 적용해 보는 교육의 필요성을 보여줍니다. 11건 중 8건은 AI 업무 기본, 2건은 데이터 분석 과정입니다.</w:t>
+        <w:rPr>
+          <w:rFonts w:ascii="맑은 고딕" w:hAnsi="맑은 고딕" w:eastAsia="맑은 고딕"/>
+          <w:b w:val="0"/>
+        </w:rPr>
+        <w:t xml:space="preserve">• 참여자가 원하는 것은 분명하다 — </w:t>
+      </w:r>
+      <w:r>
+        <w:rPr>
+          <w:rFonts w:ascii="맑은 고딕" w:hAnsi="맑은 고딕" w:eastAsia="맑은 고딕"/>
+          <w:b/>
+        </w:rPr>
+        <w:t>"실무에 바로 쓰는 기술을, 직접 해보며"</w:t>
+      </w:r>
+      <w:r>
+        <w:rPr>
+          <w:rFonts w:ascii="맑은 고딕" w:hAnsi="맑은 고딕" w:eastAsia="맑은 고딕"/>
+          <w:b w:val="0"/>
+        </w:rPr>
+        <w:t>. 실무 적용성 점수(4.3)와 실습 시간 부족 의견(최다 11건)은 같은 신호다.</w:t>
+      </w:r>
+    </w:p>
+    <w:p>
+      <w:pPr>
+        <w:ind w:left="283"/>
+      </w:pPr>
+      <w:r>
+        <w:rPr>
+          <w:rFonts w:ascii="맑은 고딕" w:hAnsi="맑은 고딕" w:eastAsia="맑은 고딕"/>
+          <w:b w:val="0"/>
+        </w:rPr>
+        <w:t xml:space="preserve">• 만족도를 깎는 요인은 내용이 아니라 </w:t>
+      </w:r>
+      <w:r>
+        <w:rPr>
+          <w:rFonts w:ascii="맑은 고딕" w:hAnsi="맑은 고딕" w:eastAsia="맑은 고딕"/>
+          <w:b/>
+        </w:rPr>
+        <w:t>환경(3.1)과 편성</w:t>
+      </w:r>
+      <w:r>
+        <w:rPr>
+          <w:rFonts w:ascii="맑은 고딕" w:hAnsi="맑은 고딕" w:eastAsia="맑은 고딕"/>
+          <w:b w:val="0"/>
+        </w:rPr>
+        <w:t>이다.</w:t>
+      </w:r>
+    </w:p>
+    <w:p>
+      <w:pPr>
+        <w:ind w:left="283"/>
+      </w:pPr>
+      <w:r>
+        <w:rPr>
+          <w:rFonts w:ascii="맑은 고딕" w:hAnsi="맑은 고딕" w:eastAsia="맑은 고딕"/>
+          <w:b w:val="0"/>
+        </w:rPr>
+        <w:t xml:space="preserve">• AI 과정은 수요(신청 초과)·만족(4.5)·후속 요구(6건)가 모두 확인된 </w:t>
+      </w:r>
+      <w:r>
+        <w:rPr>
+          <w:rFonts w:ascii="맑은 고딕" w:hAnsi="맑은 고딕" w:eastAsia="맑은 고딕"/>
+          <w:b/>
+        </w:rPr>
+        <w:t>전략 과정</w:t>
+      </w:r>
+      <w:r>
+        <w:rPr>
+          <w:rFonts w:ascii="맑은 고딕" w:hAnsi="맑은 고딕" w:eastAsia="맑은 고딕"/>
+          <w:b w:val="0"/>
+        </w:rPr>
+        <w:t>이다.</w:t>
+      </w:r>
+    </w:p>
+    <w:p>
+      <w:pPr>
+        <w:spacing w:before="200"/>
+      </w:pPr>
+      <w:r>
+        <w:rPr>
+          <w:rFonts w:ascii="맑은 고딕" w:hAnsi="맑은 고딕" w:eastAsia="맑은 고딕"/>
+          <w:b/>
+          <w:color w:val="153C78"/>
+          <w:sz w:val="24"/>
+        </w:rPr>
+        <w:t>5. 개선 3대 과제 (차기 연수 계획 반영)</w:t>
+      </w:r>
+    </w:p>
+    <w:p>
+      <w:pPr>
+        <w:ind w:left="283"/>
+      </w:pPr>
+      <w:r>
+        <w:rPr>
+          <w:rFonts w:ascii="맑은 고딕" w:hAnsi="맑은 고딕" w:eastAsia="맑은 고딕"/>
+          <w:b w:val="0"/>
+        </w:rPr>
+        <w:t xml:space="preserve">1. </w:t>
+      </w:r>
+      <w:r>
+        <w:rPr>
+          <w:rFonts w:ascii="맑은 고딕" w:hAnsi="맑은 고딕" w:eastAsia="맑은 고딕"/>
+          <w:b/>
+        </w:rPr>
+        <w:t>실습 중심 확대</w:t>
+      </w:r>
+      <w:r>
+        <w:rPr>
+          <w:rFonts w:ascii="맑은 고딕" w:hAnsi="맑은 고딕" w:eastAsia="맑은 고딕"/>
+          <w:b w:val="0"/>
+        </w:rPr>
+        <w:t xml:space="preserve"> — 인기 과정의 실습 시간 증배, 이론·시연 비중 축소</w:t>
+      </w:r>
+    </w:p>
+    <w:p>
+      <w:pPr>
+        <w:ind w:left="283"/>
+      </w:pPr>
+      <w:r>
+        <w:rPr>
+          <w:rFonts w:ascii="맑은 고딕" w:hAnsi="맑은 고딕" w:eastAsia="맑은 고딕"/>
+          <w:b w:val="0"/>
+        </w:rPr>
+        <w:t xml:space="preserve">2. </w:t>
+      </w:r>
+      <w:r>
+        <w:rPr>
+          <w:rFonts w:ascii="맑은 고딕" w:hAnsi="맑은 고딕" w:eastAsia="맑은 고딕"/>
+          <w:b/>
+        </w:rPr>
+        <w:t>교육 환경 개선</w:t>
+      </w:r>
+      <w:r>
+        <w:rPr>
+          <w:rFonts w:ascii="맑은 고딕" w:hAnsi="맑은 고딕" w:eastAsia="맑은 고딕"/>
+          <w:b w:val="0"/>
+        </w:rPr>
+        <w:t xml:space="preserve"> — 교육장 장비·네트워크 정비, 분반 운영으로 밀도 완화</w:t>
+      </w:r>
+    </w:p>
+    <w:p>
+      <w:pPr>
+        <w:ind w:left="283"/>
+      </w:pPr>
+      <w:r>
+        <w:rPr>
+          <w:rFonts w:ascii="맑은 고딕" w:hAnsi="맑은 고딕" w:eastAsia="맑은 고딕"/>
+          <w:b w:val="0"/>
+        </w:rPr>
+        <w:t xml:space="preserve">3. </w:t>
+      </w:r>
+      <w:r>
+        <w:rPr>
+          <w:rFonts w:ascii="맑은 고딕" w:hAnsi="맑은 고딕" w:eastAsia="맑은 고딕"/>
+          <w:b/>
+        </w:rPr>
+        <w:t>AI 심화 과정 신설</w:t>
+      </w:r>
+      <w:r>
+        <w:rPr>
+          <w:rFonts w:ascii="맑은 고딕" w:hAnsi="맑은 고딕" w:eastAsia="맑은 고딕"/>
+          <w:b w:val="0"/>
+        </w:rPr>
+        <w:t xml:space="preserve"> — 기존 수료자 대상 후속 과정 개설, 시리즈화</w:t>
       </w:r>
     </w:p>
     <w:p>
       <w:r>
-        <w:t>교육 환경 평균은 3.1점이며 관련 의견은 8건입니다. 장비·화면·로그인 준비뿐 아니라 좌석과 실내 환경도 점검할 필요가 있습니다.</w:t>
+        <w:rPr>
+          <w:rFonts w:ascii="맑은 고딕" w:hAnsi="맑은 고딕" w:eastAsia="맑은 고딕"/>
+          <w:b w:val="0"/>
+          <w:color w:val="5A6675"/>
+          <w:sz w:val="16"/>
+        </w:rPr>
+        <w:t>────────────────────────────────────────</w:t>
       </w:r>
     </w:p>
     <w:p>
       <w:r>
-        <w:t>내용 구성 개선 의견 5건은 모두 사내 보고서 과정입니다. 교육콘텐츠 검수는 전반 만족도 3.0점(6명)이지만 내용 구성은 4.0점이므로 낮은 만족도의 원인을 단정할 수 없습니다.</w:t>
-      </w:r>
-    </w:p>
-    <w:p>
-      <w:r>
-        <w:t>심화 요청 6건은 AI 업무 기본 4건, 데이터 분석 2건입니다. 신청 자료에서 AI 업무 기본은 49명/정원 30명(163.3%)이지만 두 자료는 별도 표본이므로 동일 집단의 변화로 해석하지 않습니다.</w:t>
-      </w:r>
-    </w:p>
-    <w:p>
-      <w:pPr>
-        <w:pStyle w:val="Heading1"/>
-      </w:pPr>
-      <w:r>
-        <w:t>5. 개선 3대 과제</w:t>
-      </w:r>
-    </w:p>
-    <w:p>
-      <w:r>
-        <w:t>차기 교육 계획을 위한 실습용 제안</w:t>
-      </w:r>
-    </w:p>
-    <w:p>
-      <w:r>
-        <w:t>1. 직무 실습 확대: 검수 의견 정리, 사내 보고서 수정, 교사·학부모 문의 답변 등 부문별 과제를 직접 완성할 시간을 늘립니다.</w:t>
-      </w:r>
-    </w:p>
-    <w:p>
-      <w:r>
-        <w:t>2. 교육 환경·구성 개선: 실습 전 장비와 로그인 상태를 확인하고, 사내 보고서 과정의 이론 비중·기존 교육 중복을 조정합니다. 콘텐츠 검수 과정은 추가 의견을 확인합니다.</w:t>
-      </w:r>
-    </w:p>
-    <w:p>
-      <w:r>
-        <w:t>3. 후속 과정 제안: AI 업무 기본과 데이터 분석의 심화 수요를 추가 조사하고, 공통 기본 과정 이후 직무별 후속 실습을 검토합니다.</w:t>
-      </w:r>
-    </w:p>
-    <w:p>
-      <w:r>
-        <w:t>수치 출처: 실습2_만족도_설문응답.xlsx의 응답원본 2~73행. 신청 수치는 실습1_연수_신청자명단.xlsx의 신청자명단 2~151행·프로그램표 2~7행. 자유 의견 38건은 응답당 하나의 대표 유형으로 분류한 예시입니다.</w:t>
+        <w:rPr>
+          <w:rFonts w:ascii="맑은 고딕" w:hAnsi="맑은 고딕" w:eastAsia="맑은 고딕"/>
+          <w:b w:val="0"/>
+          <w:color w:val="5A6675"/>
+          <w:sz w:val="18"/>
+        </w:rPr>
+        <w:t>본 자료는 교육 실습용으로 가공한 예시 데이터의 분석 결과입니다.</w:t>
       </w:r>
     </w:p>
     <w:sectPr>
       <w:pgSz w:w="12240" w:h="15840"/>
-      <w:pgMar w:top="936" w:right="1008" w:bottom="936" w:left="1008" w:header="720" w:footer="720" w:gutter="0"/>
+      <w:pgMar w:top="1134" w:right="1247" w:bottom="1134" w:left="1247" w:header="720" w:footer="720" w:gutter="0"/>
       <w:cols w:space="720"/>
       <w:docGrid w:linePitch="360"/>
     </w:sectPr>
@@ -1794,13 +1159,9 @@
     <w:name w:val="Normal"/>
     <w:qFormat/>
     <w:rsid w:val="00FC693F"/>
-    <w:pPr>
-      <w:spacing w:after="100" w:line="269" w:lineRule="auto"/>
-    </w:pPr>
     <w:rPr>
       <w:rFonts w:ascii="맑은 고딕" w:hAnsi="맑은 고딕" w:eastAsia="맑은 고딕"/>
-      <w:color w:val="000000"/>
-      <w:sz w:val="19"/>
+      <w:sz w:val="21"/>
     </w:rPr>
   </w:style>
   <w:style w:type="paragraph" w:styleId="Header">
@@ -1858,15 +1219,15 @@
     <w:pPr>
       <w:keepNext/>
       <w:keepLines/>
-      <w:spacing w:before="200" w:after="100"/>
+      <w:spacing w:before="480" w:after="0"/>
       <w:outlineLvl w:val="0"/>
     </w:pPr>
     <w:rPr>
-      <w:rFonts w:asciiTheme="majorHAnsi" w:eastAsiaTheme="majorEastAsia" w:hAnsiTheme="majorHAnsi" w:cstheme="majorBidi" w:ascii="맑은 고딕" w:hAnsi="맑은 고딕" w:eastAsia="맑은 고딕"/>
+      <w:rFonts w:asciiTheme="majorHAnsi" w:eastAsiaTheme="majorEastAsia" w:hAnsiTheme="majorHAnsi" w:cstheme="majorBidi"/>
       <w:b/>
       <w:bCs/>
-      <w:color w:val="000000"/>
-      <w:sz w:val="24"/>
+      <w:color w:val="365F91" w:themeColor="accent1" w:themeShade="BF"/>
+      <w:sz w:val="28"/>
       <w:szCs w:val="28"/>
     </w:rPr>
   </w:style>
@@ -1886,10 +1247,10 @@
       <w:outlineLvl w:val="1"/>
     </w:pPr>
     <w:rPr>
-      <w:rFonts w:asciiTheme="majorHAnsi" w:eastAsiaTheme="majorEastAsia" w:hAnsiTheme="majorHAnsi" w:cstheme="majorBidi" w:ascii="맑은 고딕" w:hAnsi="맑은 고딕" w:eastAsia="맑은 고딕"/>
+      <w:rFonts w:asciiTheme="majorHAnsi" w:eastAsiaTheme="majorEastAsia" w:hAnsiTheme="majorHAnsi" w:cstheme="majorBidi"/>
       <w:b/>
       <w:bCs/>
-      <w:color w:val="000000"/>
+      <w:color w:val="4F81BD" w:themeColor="accent1"/>
       <w:sz w:val="26"/>
       <w:szCs w:val="26"/>
     </w:rPr>
@@ -2151,11 +1512,11 @@
       <w:contextualSpacing/>
     </w:pPr>
     <w:rPr>
-      <w:rFonts w:asciiTheme="majorHAnsi" w:eastAsiaTheme="majorEastAsia" w:hAnsiTheme="majorHAnsi" w:cstheme="majorBidi" w:ascii="맑은 고딕" w:hAnsi="맑은 고딕" w:eastAsia="맑은 고딕"/>
-      <w:color w:val="000000"/>
+      <w:rFonts w:asciiTheme="majorHAnsi" w:eastAsiaTheme="majorEastAsia" w:hAnsiTheme="majorHAnsi" w:cstheme="majorBidi"/>
+      <w:color w:val="17365D" w:themeColor="text2" w:themeShade="BF"/>
       <w:spacing w:val="5"/>
       <w:kern w:val="28"/>
-      <w:sz w:val="40"/>
+      <w:sz w:val="52"/>
       <w:szCs w:val="52"/>
     </w:rPr>
   </w:style>
@@ -2188,12 +1549,12 @@
       </w:numPr>
     </w:pPr>
     <w:rPr>
-      <w:rFonts w:asciiTheme="majorHAnsi" w:eastAsiaTheme="majorEastAsia" w:hAnsiTheme="majorHAnsi" w:cstheme="majorBidi" w:ascii="맑은 고딕" w:hAnsi="맑은 고딕" w:eastAsia="맑은 고딕"/>
+      <w:rFonts w:asciiTheme="majorHAnsi" w:eastAsiaTheme="majorEastAsia" w:hAnsiTheme="majorHAnsi" w:cstheme="majorBidi"/>
       <w:i/>
       <w:iCs/>
-      <w:color w:val="000000"/>
+      <w:color w:val="4F81BD" w:themeColor="accent1"/>
       <w:spacing w:val="15"/>
-      <w:sz w:val="26"/>
+      <w:sz w:val="24"/>
       <w:szCs w:val="24"/>
     </w:rPr>
   </w:style>

</xml_diff>